<commit_message>
vault backup: 2023-11-20 12:34:38
</commit_message>
<xml_diff>
--- a/Cours généraux/CEJM/Supports/Revision/CEJM questions première année thème 2(1).docx
+++ b/Cours généraux/CEJM/Supports/Revision/CEJM questions première année thème 2(1).docx
@@ -132,6 +132,114 @@
     </w:p>
     <w:p>
       <w:pPr>
+        <w:pStyle w:val="Paragraphedeliste"/>
+        <w:numPr>
+          <w:ilvl w:val="0"/>
+          <w:numId w:val="2"/>
+        </w:numPr>
+        <w:tabs>
+          <w:tab w:val="left" w:pos="3915"/>
+        </w:tabs>
+        <w:rPr>
+          <w:kern w:val="0"/>
+          <w:sz w:val="24"/>
+          <w:szCs w:val="24"/>
+          <w14:ligatures w14:val="none"/>
+        </w:rPr>
+      </w:pPr>
+      <w:r>
+        <w:rPr>
+          <w:kern w:val="0"/>
+          <w:sz w:val="24"/>
+          <w:szCs w:val="24"/>
+          <w14:ligatures w14:val="none"/>
+        </w:rPr>
+        <w:t>L’inflation</w:t>
+      </w:r>
+    </w:p>
+    <w:p>
+      <w:pPr>
+        <w:pStyle w:val="Paragraphedeliste"/>
+        <w:numPr>
+          <w:ilvl w:val="0"/>
+          <w:numId w:val="2"/>
+        </w:numPr>
+        <w:tabs>
+          <w:tab w:val="left" w:pos="3915"/>
+        </w:tabs>
+        <w:rPr>
+          <w:kern w:val="0"/>
+          <w:sz w:val="24"/>
+          <w:szCs w:val="24"/>
+          <w14:ligatures w14:val="none"/>
+        </w:rPr>
+      </w:pPr>
+      <w:r>
+        <w:rPr>
+          <w:kern w:val="0"/>
+          <w:sz w:val="24"/>
+          <w:szCs w:val="24"/>
+          <w14:ligatures w14:val="none"/>
+        </w:rPr>
+        <w:t>Le chômage</w:t>
+      </w:r>
+    </w:p>
+    <w:p>
+      <w:pPr>
+        <w:pStyle w:val="Paragraphedeliste"/>
+        <w:numPr>
+          <w:ilvl w:val="0"/>
+          <w:numId w:val="2"/>
+        </w:numPr>
+        <w:tabs>
+          <w:tab w:val="left" w:pos="3915"/>
+        </w:tabs>
+        <w:rPr>
+          <w:kern w:val="0"/>
+          <w:sz w:val="24"/>
+          <w:szCs w:val="24"/>
+          <w14:ligatures w14:val="none"/>
+        </w:rPr>
+      </w:pPr>
+      <w:r>
+        <w:rPr>
+          <w:kern w:val="0"/>
+          <w:sz w:val="24"/>
+          <w:szCs w:val="24"/>
+          <w14:ligatures w14:val="none"/>
+        </w:rPr>
+        <w:t>La croissance économique</w:t>
+      </w:r>
+    </w:p>
+    <w:p>
+      <w:pPr>
+        <w:pStyle w:val="Paragraphedeliste"/>
+        <w:numPr>
+          <w:ilvl w:val="0"/>
+          <w:numId w:val="2"/>
+        </w:numPr>
+        <w:tabs>
+          <w:tab w:val="left" w:pos="3915"/>
+        </w:tabs>
+        <w:rPr>
+          <w:kern w:val="0"/>
+          <w:sz w:val="24"/>
+          <w:szCs w:val="24"/>
+          <w14:ligatures w14:val="none"/>
+        </w:rPr>
+      </w:pPr>
+      <w:r>
+        <w:rPr>
+          <w:kern w:val="0"/>
+          <w:sz w:val="24"/>
+          <w:szCs w:val="24"/>
+          <w14:ligatures w14:val="none"/>
+        </w:rPr>
+        <w:t>Le PIB</w:t>
+      </w:r>
+    </w:p>
+    <w:p>
+      <w:pPr>
         <w:tabs>
           <w:tab w:val="left" w:pos="3915"/>
         </w:tabs>
@@ -211,6 +319,28 @@
           <w:szCs w:val="24"/>
           <w14:ligatures w14:val="none"/>
         </w:rPr>
+        <w:t>Augmentation de la production entre 2 périodes. Elle est mesurée grâce au PIB</w:t>
+      </w:r>
+    </w:p>
+    <w:p>
+      <w:pPr>
+        <w:tabs>
+          <w:tab w:val="left" w:pos="3915"/>
+        </w:tabs>
+        <w:rPr>
+          <w:kern w:val="0"/>
+          <w:sz w:val="24"/>
+          <w:szCs w:val="24"/>
+          <w14:ligatures w14:val="none"/>
+        </w:rPr>
+      </w:pPr>
+      <w:r>
+        <w:rPr>
+          <w:kern w:val="0"/>
+          <w:sz w:val="24"/>
+          <w:szCs w:val="24"/>
+          <w14:ligatures w14:val="none"/>
+        </w:rPr>
         <w:t xml:space="preserve">4 Expliquez ce qu’est le PIB Produit Intérieur Brut </w:t>
       </w:r>
     </w:p>
@@ -233,6 +363,28 @@
           <w:szCs w:val="24"/>
           <w14:ligatures w14:val="none"/>
         </w:rPr>
+        <w:t>C’est la somme des valeurs ajouté pour les entreprises résident en France.</w:t>
+      </w:r>
+    </w:p>
+    <w:p>
+      <w:pPr>
+        <w:tabs>
+          <w:tab w:val="left" w:pos="3915"/>
+        </w:tabs>
+        <w:rPr>
+          <w:kern w:val="0"/>
+          <w:sz w:val="24"/>
+          <w:szCs w:val="24"/>
+          <w14:ligatures w14:val="none"/>
+        </w:rPr>
+      </w:pPr>
+      <w:r>
+        <w:rPr>
+          <w:kern w:val="0"/>
+          <w:sz w:val="24"/>
+          <w:szCs w:val="24"/>
+          <w14:ligatures w14:val="none"/>
+        </w:rPr>
         <w:t>5 Expliquez ce qu’est une récession économique</w:t>
       </w:r>
     </w:p>
@@ -255,6 +407,48 @@
           <w:szCs w:val="24"/>
           <w14:ligatures w14:val="none"/>
         </w:rPr>
+        <w:t xml:space="preserve">C’est lorsque la croissance économique est positive mais qu’elle est moins forte que la dernière période. </w:t>
+      </w:r>
+      <w:proofErr w:type="gramStart"/>
+      <w:r>
+        <w:rPr>
+          <w:kern w:val="0"/>
+          <w:sz w:val="24"/>
+          <w:szCs w:val="24"/>
+          <w14:ligatures w14:val="none"/>
+        </w:rPr>
+        <w:t>La croissance ralenti</w:t>
+      </w:r>
+      <w:proofErr w:type="gramEnd"/>
+      <w:r>
+        <w:rPr>
+          <w:kern w:val="0"/>
+          <w:sz w:val="24"/>
+          <w:szCs w:val="24"/>
+          <w14:ligatures w14:val="none"/>
+        </w:rPr>
+        <w:t>.</w:t>
+      </w:r>
+    </w:p>
+    <w:p>
+      <w:pPr>
+        <w:tabs>
+          <w:tab w:val="left" w:pos="3915"/>
+        </w:tabs>
+        <w:rPr>
+          <w:kern w:val="0"/>
+          <w:sz w:val="24"/>
+          <w:szCs w:val="24"/>
+          <w14:ligatures w14:val="none"/>
+        </w:rPr>
+      </w:pPr>
+      <w:r>
+        <w:rPr>
+          <w:kern w:val="0"/>
+          <w:sz w:val="24"/>
+          <w:szCs w:val="24"/>
+          <w14:ligatures w14:val="none"/>
+        </w:rPr>
         <w:t>6 Expliquez ce qu’est une dépression économique</w:t>
       </w:r>
     </w:p>
@@ -277,6 +471,28 @@
           <w:szCs w:val="24"/>
           <w14:ligatures w14:val="none"/>
         </w:rPr>
+        <w:t>C’est lorsque la croissance économique est négative.</w:t>
+      </w:r>
+    </w:p>
+    <w:p>
+      <w:pPr>
+        <w:tabs>
+          <w:tab w:val="left" w:pos="3915"/>
+        </w:tabs>
+        <w:rPr>
+          <w:kern w:val="0"/>
+          <w:sz w:val="24"/>
+          <w:szCs w:val="24"/>
+          <w14:ligatures w14:val="none"/>
+        </w:rPr>
+      </w:pPr>
+      <w:r>
+        <w:rPr>
+          <w:kern w:val="0"/>
+          <w:sz w:val="24"/>
+          <w:szCs w:val="24"/>
+          <w14:ligatures w14:val="none"/>
+        </w:rPr>
         <w:t>7 Expliquez en quoi la croissance est bénéfique tant aux entreprises qu’à la population active</w:t>
       </w:r>
     </w:p>
@@ -299,6 +515,68 @@
           <w:szCs w:val="24"/>
           <w14:ligatures w14:val="none"/>
         </w:rPr>
+        <w:t xml:space="preserve">La croissance permet </w:t>
+      </w:r>
+      <w:proofErr w:type="gramStart"/>
+      <w:r>
+        <w:rPr>
+          <w:kern w:val="0"/>
+          <w:sz w:val="24"/>
+          <w:szCs w:val="24"/>
+          <w14:ligatures w14:val="none"/>
+        </w:rPr>
+        <w:t>aux entreprise</w:t>
+      </w:r>
+      <w:proofErr w:type="gramEnd"/>
+      <w:r>
+        <w:rPr>
+          <w:kern w:val="0"/>
+          <w:sz w:val="24"/>
+          <w:szCs w:val="24"/>
+          <w14:ligatures w14:val="none"/>
+        </w:rPr>
+        <w:t xml:space="preserve"> d’augmenter leurs production, et donc leurs bénéfices. Et la population active </w:t>
+      </w:r>
+      <w:proofErr w:type="gramStart"/>
+      <w:r>
+        <w:rPr>
+          <w:kern w:val="0"/>
+          <w:sz w:val="24"/>
+          <w:szCs w:val="24"/>
+          <w14:ligatures w14:val="none"/>
+        </w:rPr>
+        <w:t>ont</w:t>
+      </w:r>
+      <w:proofErr w:type="gramEnd"/>
+      <w:r>
+        <w:rPr>
+          <w:kern w:val="0"/>
+          <w:sz w:val="24"/>
+          <w:szCs w:val="24"/>
+          <w14:ligatures w14:val="none"/>
+        </w:rPr>
+        <w:t xml:space="preserve"> en conséquence des emplois, et donc des revenues.</w:t>
+      </w:r>
+    </w:p>
+    <w:p>
+      <w:pPr>
+        <w:tabs>
+          <w:tab w:val="left" w:pos="3915"/>
+        </w:tabs>
+        <w:rPr>
+          <w:kern w:val="0"/>
+          <w:sz w:val="24"/>
+          <w:szCs w:val="24"/>
+          <w14:ligatures w14:val="none"/>
+        </w:rPr>
+      </w:pPr>
+      <w:r>
+        <w:rPr>
+          <w:kern w:val="0"/>
+          <w:sz w:val="24"/>
+          <w:szCs w:val="24"/>
+          <w14:ligatures w14:val="none"/>
+        </w:rPr>
         <w:t>8 Expliquez le chômage conjoncturel</w:t>
       </w:r>
     </w:p>
@@ -321,6 +599,48 @@
           <w:szCs w:val="24"/>
           <w14:ligatures w14:val="none"/>
         </w:rPr>
+        <w:t xml:space="preserve">C’est quand le chômage est </w:t>
+      </w:r>
+      <w:proofErr w:type="gramStart"/>
+      <w:r>
+        <w:rPr>
+          <w:kern w:val="0"/>
+          <w:sz w:val="24"/>
+          <w:szCs w:val="24"/>
+          <w14:ligatures w14:val="none"/>
+        </w:rPr>
+        <w:t>du</w:t>
+      </w:r>
+      <w:proofErr w:type="gramEnd"/>
+      <w:r>
+        <w:rPr>
+          <w:kern w:val="0"/>
+          <w:sz w:val="24"/>
+          <w:szCs w:val="24"/>
+          <w14:ligatures w14:val="none"/>
+        </w:rPr>
+        <w:t xml:space="preserve"> à une insuffisance de la production, d’un manque d’offre d’emploie</w:t>
+      </w:r>
+    </w:p>
+    <w:p>
+      <w:pPr>
+        <w:tabs>
+          <w:tab w:val="left" w:pos="3915"/>
+        </w:tabs>
+        <w:rPr>
+          <w:kern w:val="0"/>
+          <w:sz w:val="24"/>
+          <w:szCs w:val="24"/>
+          <w14:ligatures w14:val="none"/>
+        </w:rPr>
+      </w:pPr>
+      <w:r>
+        <w:rPr>
+          <w:kern w:val="0"/>
+          <w:sz w:val="24"/>
+          <w:szCs w:val="24"/>
+          <w14:ligatures w14:val="none"/>
+        </w:rPr>
         <w:t>9 Expliquez le chômage structurel</w:t>
       </w:r>
     </w:p>
@@ -336,6 +656,19 @@
           <w14:ligatures w14:val="none"/>
         </w:rPr>
       </w:pPr>
+    </w:p>
+    <w:p>
+      <w:pPr>
+        <w:tabs>
+          <w:tab w:val="left" w:pos="3915"/>
+        </w:tabs>
+        <w:rPr>
+          <w:kern w:val="0"/>
+          <w:sz w:val="24"/>
+          <w:szCs w:val="24"/>
+          <w14:ligatures w14:val="none"/>
+        </w:rPr>
+      </w:pPr>
       <w:r>
         <w:rPr>
           <w:kern w:val="0"/>
@@ -365,6 +698,48 @@
           <w:szCs w:val="24"/>
           <w14:ligatures w14:val="none"/>
         </w:rPr>
+        <w:t>C’est le temps utilisé pour une recherche d’</w:t>
+      </w:r>
+      <w:proofErr w:type="spellStart"/>
+      <w:r>
+        <w:rPr>
+          <w:kern w:val="0"/>
+          <w:sz w:val="24"/>
+          <w:szCs w:val="24"/>
+          <w14:ligatures w14:val="none"/>
+        </w:rPr>
+        <w:t>emploie</w:t>
+      </w:r>
+      <w:proofErr w:type="spellEnd"/>
+      <w:r>
+        <w:rPr>
+          <w:kern w:val="0"/>
+          <w:sz w:val="24"/>
+          <w:szCs w:val="24"/>
+          <w14:ligatures w14:val="none"/>
+        </w:rPr>
+        <w:t>.</w:t>
+      </w:r>
+    </w:p>
+    <w:p>
+      <w:pPr>
+        <w:tabs>
+          <w:tab w:val="left" w:pos="3915"/>
+        </w:tabs>
+        <w:rPr>
+          <w:kern w:val="0"/>
+          <w:sz w:val="24"/>
+          <w:szCs w:val="24"/>
+          <w14:ligatures w14:val="none"/>
+        </w:rPr>
+      </w:pPr>
+      <w:r>
+        <w:rPr>
+          <w:kern w:val="0"/>
+          <w:sz w:val="24"/>
+          <w:szCs w:val="24"/>
+          <w14:ligatures w14:val="none"/>
+        </w:rPr>
         <w:t>11 Expliquez ce qu’est une politique publique</w:t>
       </w:r>
     </w:p>
@@ -380,6 +755,19 @@
           <w14:ligatures w14:val="none"/>
         </w:rPr>
       </w:pPr>
+    </w:p>
+    <w:p>
+      <w:pPr>
+        <w:tabs>
+          <w:tab w:val="left" w:pos="3915"/>
+        </w:tabs>
+        <w:rPr>
+          <w:kern w:val="0"/>
+          <w:sz w:val="24"/>
+          <w:szCs w:val="24"/>
+          <w14:ligatures w14:val="none"/>
+        </w:rPr>
+      </w:pPr>
       <w:r>
         <w:rPr>
           <w:kern w:val="0"/>
@@ -402,6 +790,19 @@
           <w14:ligatures w14:val="none"/>
         </w:rPr>
       </w:pPr>
+    </w:p>
+    <w:p>
+      <w:pPr>
+        <w:tabs>
+          <w:tab w:val="left" w:pos="3915"/>
+        </w:tabs>
+        <w:rPr>
+          <w:kern w:val="0"/>
+          <w:sz w:val="24"/>
+          <w:szCs w:val="24"/>
+          <w14:ligatures w14:val="none"/>
+        </w:rPr>
+      </w:pPr>
       <w:r>
         <w:rPr>
           <w:kern w:val="0"/>
@@ -431,6 +832,46 @@
           <w:szCs w:val="24"/>
           <w14:ligatures w14:val="none"/>
         </w:rPr>
+        <w:t xml:space="preserve">Modification en profondeur de la structure d’un pays pour favoriser </w:t>
+      </w:r>
+      <w:r>
+        <w:rPr>
+          <w:kern w:val="0"/>
+          <w:sz w:val="24"/>
+          <w:szCs w:val="24"/>
+          <w14:ligatures w14:val="none"/>
+        </w:rPr>
+        <w:t>son économie</w:t>
+      </w:r>
+      <w:r>
+        <w:rPr>
+          <w:kern w:val="0"/>
+          <w:sz w:val="24"/>
+          <w:szCs w:val="24"/>
+          <w14:ligatures w14:val="none"/>
+        </w:rPr>
+        <w:t>.</w:t>
+      </w:r>
+    </w:p>
+    <w:p>
+      <w:pPr>
+        <w:tabs>
+          <w:tab w:val="left" w:pos="3915"/>
+        </w:tabs>
+        <w:rPr>
+          <w:kern w:val="0"/>
+          <w:sz w:val="24"/>
+          <w:szCs w:val="24"/>
+          <w14:ligatures w14:val="none"/>
+        </w:rPr>
+      </w:pPr>
+      <w:r>
+        <w:rPr>
+          <w:kern w:val="0"/>
+          <w:sz w:val="24"/>
+          <w:szCs w:val="24"/>
+          <w14:ligatures w14:val="none"/>
+        </w:rPr>
         <w:t xml:space="preserve">14 Expliquez ce qu’est une allocation des ressources, un des rôles essentiels de l’Etat </w:t>
       </w:r>
     </w:p>
@@ -453,6 +894,28 @@
           <w:szCs w:val="24"/>
           <w14:ligatures w14:val="none"/>
         </w:rPr>
+        <w:t>C’est la mise a disposition de service non-marchand gratuitement pour la population. L’allocation des ressources est financée via les impôts</w:t>
+      </w:r>
+    </w:p>
+    <w:p>
+      <w:pPr>
+        <w:tabs>
+          <w:tab w:val="left" w:pos="3915"/>
+        </w:tabs>
+        <w:rPr>
+          <w:kern w:val="0"/>
+          <w:sz w:val="24"/>
+          <w:szCs w:val="24"/>
+          <w14:ligatures w14:val="none"/>
+        </w:rPr>
+      </w:pPr>
+      <w:r>
+        <w:rPr>
+          <w:kern w:val="0"/>
+          <w:sz w:val="24"/>
+          <w:szCs w:val="24"/>
+          <w14:ligatures w14:val="none"/>
+        </w:rPr>
         <w:t>15 Dîtes ce qu’est un bien public et donnez-en les 2 principes</w:t>
       </w:r>
     </w:p>
@@ -475,6 +938,125 @@
           <w:szCs w:val="24"/>
           <w14:ligatures w14:val="none"/>
         </w:rPr>
+        <w:t>Un bien public est une allocation de ressources pouvant être « pur » s’il respecte 2 principes :</w:t>
+      </w:r>
+    </w:p>
+    <w:p>
+      <w:pPr>
+        <w:pStyle w:val="Paragraphedeliste"/>
+        <w:numPr>
+          <w:ilvl w:val="0"/>
+          <w:numId w:val="1"/>
+        </w:numPr>
+        <w:tabs>
+          <w:tab w:val="left" w:pos="3915"/>
+        </w:tabs>
+        <w:rPr>
+          <w:kern w:val="0"/>
+          <w:sz w:val="24"/>
+          <w:szCs w:val="24"/>
+          <w14:ligatures w14:val="none"/>
+        </w:rPr>
+      </w:pPr>
+      <w:r>
+        <w:rPr>
+          <w:kern w:val="0"/>
+          <w:sz w:val="24"/>
+          <w:szCs w:val="24"/>
+          <w14:ligatures w14:val="none"/>
+        </w:rPr>
+        <w:t xml:space="preserve">La </w:t>
+      </w:r>
+      <w:proofErr w:type="gramStart"/>
+      <w:r>
+        <w:rPr>
+          <w:kern w:val="0"/>
+          <w:sz w:val="24"/>
+          <w:szCs w:val="24"/>
+          <w14:ligatures w14:val="none"/>
+        </w:rPr>
+        <w:t>non excluabilité</w:t>
+      </w:r>
+      <w:proofErr w:type="gramEnd"/>
+      <w:r>
+        <w:rPr>
+          <w:kern w:val="0"/>
+          <w:sz w:val="24"/>
+          <w:szCs w:val="24"/>
+          <w14:ligatures w14:val="none"/>
+        </w:rPr>
+        <w:t xml:space="preserve"> (Tout le monde y a droit)</w:t>
+      </w:r>
+    </w:p>
+    <w:p>
+      <w:pPr>
+        <w:pStyle w:val="Paragraphedeliste"/>
+        <w:numPr>
+          <w:ilvl w:val="0"/>
+          <w:numId w:val="1"/>
+        </w:numPr>
+        <w:tabs>
+          <w:tab w:val="left" w:pos="3915"/>
+        </w:tabs>
+        <w:rPr>
+          <w:kern w:val="0"/>
+          <w:sz w:val="24"/>
+          <w:szCs w:val="24"/>
+          <w14:ligatures w14:val="none"/>
+        </w:rPr>
+      </w:pPr>
+      <w:proofErr w:type="gramStart"/>
+      <w:r>
+        <w:rPr>
+          <w:kern w:val="0"/>
+          <w:sz w:val="24"/>
+          <w:szCs w:val="24"/>
+          <w14:ligatures w14:val="none"/>
+        </w:rPr>
+        <w:t>L’</w:t>
+      </w:r>
+      <w:r>
+        <w:t xml:space="preserve"> </w:t>
+      </w:r>
+      <w:r>
+        <w:rPr>
+          <w:kern w:val="0"/>
+          <w:sz w:val="24"/>
+          <w:szCs w:val="24"/>
+          <w14:ligatures w14:val="none"/>
+        </w:rPr>
+        <w:t>indivisibilité</w:t>
+      </w:r>
+      <w:proofErr w:type="gramEnd"/>
+      <w:r>
+        <w:rPr>
+          <w:kern w:val="0"/>
+          <w:sz w:val="24"/>
+          <w:szCs w:val="24"/>
+          <w14:ligatures w14:val="none"/>
+        </w:rPr>
+        <w:t xml:space="preserve"> (Tout le monde peut en bénéficier)</w:t>
+      </w:r>
+    </w:p>
+    <w:p>
+      <w:pPr>
+        <w:tabs>
+          <w:tab w:val="left" w:pos="3915"/>
+        </w:tabs>
+        <w:rPr>
+          <w:kern w:val="0"/>
+          <w:sz w:val="24"/>
+          <w:szCs w:val="24"/>
+          <w14:ligatures w14:val="none"/>
+        </w:rPr>
+      </w:pPr>
+      <w:r>
+        <w:rPr>
+          <w:kern w:val="0"/>
+          <w:sz w:val="24"/>
+          <w:szCs w:val="24"/>
+          <w14:ligatures w14:val="none"/>
+        </w:rPr>
         <w:t>16 Expliquez ce qu’est un bien public pur et un bien public impur</w:t>
       </w:r>
     </w:p>
@@ -497,6 +1079,28 @@
           <w:szCs w:val="24"/>
           <w14:ligatures w14:val="none"/>
         </w:rPr>
+        <w:t>Un bien public pur respecte les 2 principes. Sinon il est qualifié d’impur.</w:t>
+      </w:r>
+    </w:p>
+    <w:p>
+      <w:pPr>
+        <w:tabs>
+          <w:tab w:val="left" w:pos="3915"/>
+        </w:tabs>
+        <w:rPr>
+          <w:kern w:val="0"/>
+          <w:sz w:val="24"/>
+          <w:szCs w:val="24"/>
+          <w14:ligatures w14:val="none"/>
+        </w:rPr>
+      </w:pPr>
+      <w:r>
+        <w:rPr>
+          <w:kern w:val="0"/>
+          <w:sz w:val="24"/>
+          <w:szCs w:val="24"/>
+          <w14:ligatures w14:val="none"/>
+        </w:rPr>
         <w:t>17 Expliquez ce qu’est la redistribution des ressources, un des principaux rôles de l’Etat</w:t>
       </w:r>
     </w:p>
@@ -519,6 +1123,50 @@
           <w:szCs w:val="24"/>
           <w14:ligatures w14:val="none"/>
         </w:rPr>
+        <w:t xml:space="preserve">La redistribution se base sur l’une des devises de l’état, l’égalité. Il consiste </w:t>
+      </w:r>
+      <w:proofErr w:type="spellStart"/>
+      <w:proofErr w:type="gramStart"/>
+      <w:r>
+        <w:rPr>
+          <w:kern w:val="0"/>
+          <w:sz w:val="24"/>
+          <w:szCs w:val="24"/>
+          <w14:ligatures w14:val="none"/>
+        </w:rPr>
+        <w:t>a</w:t>
+      </w:r>
+      <w:proofErr w:type="spellEnd"/>
+      <w:proofErr w:type="gramEnd"/>
+      <w:r>
+        <w:rPr>
+          <w:kern w:val="0"/>
+          <w:sz w:val="24"/>
+          <w:szCs w:val="24"/>
+          <w14:ligatures w14:val="none"/>
+        </w:rPr>
+        <w:t xml:space="preserve"> redistribuer les ressource récolter par les impôts pour les redistribuer sous forme d’allocation ou de prime.</w:t>
+      </w:r>
+    </w:p>
+    <w:p>
+      <w:pPr>
+        <w:tabs>
+          <w:tab w:val="left" w:pos="3915"/>
+        </w:tabs>
+        <w:rPr>
+          <w:kern w:val="0"/>
+          <w:sz w:val="24"/>
+          <w:szCs w:val="24"/>
+          <w14:ligatures w14:val="none"/>
+        </w:rPr>
+      </w:pPr>
+      <w:r>
+        <w:rPr>
+          <w:kern w:val="0"/>
+          <w:sz w:val="24"/>
+          <w:szCs w:val="24"/>
+          <w14:ligatures w14:val="none"/>
+        </w:rPr>
         <w:t>18 Expliquez les deux outils essentiels de la redistribution des ressources</w:t>
       </w:r>
     </w:p>
@@ -534,6 +1182,19 @@
           <w14:ligatures w14:val="none"/>
         </w:rPr>
       </w:pPr>
+    </w:p>
+    <w:p>
+      <w:pPr>
+        <w:tabs>
+          <w:tab w:val="left" w:pos="3915"/>
+        </w:tabs>
+        <w:rPr>
+          <w:kern w:val="0"/>
+          <w:sz w:val="24"/>
+          <w:szCs w:val="24"/>
+          <w14:ligatures w14:val="none"/>
+        </w:rPr>
+      </w:pPr>
       <w:r>
         <w:rPr>
           <w:kern w:val="0"/>
@@ -563,6 +1224,48 @@
           <w:szCs w:val="24"/>
           <w14:ligatures w14:val="none"/>
         </w:rPr>
+        <w:t xml:space="preserve">Ensemble d’action sur </w:t>
+      </w:r>
+      <w:proofErr w:type="gramStart"/>
+      <w:r>
+        <w:rPr>
+          <w:kern w:val="0"/>
+          <w:sz w:val="24"/>
+          <w:szCs w:val="24"/>
+          <w14:ligatures w14:val="none"/>
+        </w:rPr>
+        <w:t>les ressource</w:t>
+      </w:r>
+      <w:proofErr w:type="gramEnd"/>
+      <w:r>
+        <w:rPr>
+          <w:kern w:val="0"/>
+          <w:sz w:val="24"/>
+          <w:szCs w:val="24"/>
+          <w14:ligatures w14:val="none"/>
+        </w:rPr>
+        <w:t xml:space="preserve"> et le dépense de l’état.</w:t>
+      </w:r>
+    </w:p>
+    <w:p>
+      <w:pPr>
+        <w:tabs>
+          <w:tab w:val="left" w:pos="3915"/>
+        </w:tabs>
+        <w:rPr>
+          <w:kern w:val="0"/>
+          <w:sz w:val="24"/>
+          <w:szCs w:val="24"/>
+          <w14:ligatures w14:val="none"/>
+        </w:rPr>
+      </w:pPr>
+      <w:r>
+        <w:rPr>
+          <w:kern w:val="0"/>
+          <w:sz w:val="24"/>
+          <w:szCs w:val="24"/>
+          <w14:ligatures w14:val="none"/>
+        </w:rPr>
         <w:t>29 Expliquez ce qu’est une politique monétaire et à qui en revient la charge</w:t>
       </w:r>
     </w:p>
@@ -585,6 +1288,68 @@
           <w:szCs w:val="24"/>
           <w14:ligatures w14:val="none"/>
         </w:rPr>
+        <w:t xml:space="preserve">La politique monétaire est </w:t>
+      </w:r>
+      <w:proofErr w:type="gramStart"/>
+      <w:r>
+        <w:rPr>
+          <w:kern w:val="0"/>
+          <w:sz w:val="24"/>
+          <w:szCs w:val="24"/>
+          <w14:ligatures w14:val="none"/>
+        </w:rPr>
+        <w:t>gérer</w:t>
+      </w:r>
+      <w:proofErr w:type="gramEnd"/>
+      <w:r>
+        <w:rPr>
+          <w:kern w:val="0"/>
+          <w:sz w:val="24"/>
+          <w:szCs w:val="24"/>
+          <w14:ligatures w14:val="none"/>
+        </w:rPr>
+        <w:t xml:space="preserve"> par la Banque Centrale, son rôle est de fixer les taux </w:t>
+      </w:r>
+      <w:proofErr w:type="spellStart"/>
+      <w:r>
+        <w:rPr>
+          <w:kern w:val="0"/>
+          <w:sz w:val="24"/>
+          <w:szCs w:val="24"/>
+          <w14:ligatures w14:val="none"/>
+        </w:rPr>
+        <w:t>dirécteurs</w:t>
+      </w:r>
+      <w:proofErr w:type="spellEnd"/>
+      <w:r>
+        <w:rPr>
+          <w:kern w:val="0"/>
+          <w:sz w:val="24"/>
+          <w:szCs w:val="24"/>
+          <w14:ligatures w14:val="none"/>
+        </w:rPr>
+        <w:t>.</w:t>
+      </w:r>
+    </w:p>
+    <w:p>
+      <w:pPr>
+        <w:tabs>
+          <w:tab w:val="left" w:pos="3915"/>
+        </w:tabs>
+        <w:rPr>
+          <w:kern w:val="0"/>
+          <w:sz w:val="24"/>
+          <w:szCs w:val="24"/>
+          <w14:ligatures w14:val="none"/>
+        </w:rPr>
+      </w:pPr>
+      <w:r>
+        <w:rPr>
+          <w:kern w:val="0"/>
+          <w:sz w:val="24"/>
+          <w:szCs w:val="24"/>
+          <w14:ligatures w14:val="none"/>
+        </w:rPr>
         <w:t xml:space="preserve">30 Donnez les règles du Pacte de Maastricht (3 principes essentiels) </w:t>
       </w:r>
     </w:p>
@@ -607,6 +1372,118 @@
           <w:szCs w:val="24"/>
           <w14:ligatures w14:val="none"/>
         </w:rPr>
+        <w:t xml:space="preserve">Les 3 principes à respecter pour rentrer </w:t>
+      </w:r>
+      <w:proofErr w:type="gramStart"/>
+      <w:r>
+        <w:rPr>
+          <w:kern w:val="0"/>
+          <w:sz w:val="24"/>
+          <w:szCs w:val="24"/>
+          <w14:ligatures w14:val="none"/>
+        </w:rPr>
+        <w:t>au seins</w:t>
+      </w:r>
+      <w:proofErr w:type="gramEnd"/>
+      <w:r>
+        <w:rPr>
+          <w:kern w:val="0"/>
+          <w:sz w:val="24"/>
+          <w:szCs w:val="24"/>
+          <w14:ligatures w14:val="none"/>
+        </w:rPr>
+        <w:t xml:space="preserve"> de l’UE sont :</w:t>
+      </w:r>
+    </w:p>
+    <w:p>
+      <w:pPr>
+        <w:pStyle w:val="Paragraphedeliste"/>
+        <w:numPr>
+          <w:ilvl w:val="0"/>
+          <w:numId w:val="1"/>
+        </w:numPr>
+        <w:tabs>
+          <w:tab w:val="left" w:pos="3915"/>
+        </w:tabs>
+        <w:rPr>
+          <w:kern w:val="0"/>
+          <w:sz w:val="24"/>
+          <w:szCs w:val="24"/>
+          <w14:ligatures w14:val="none"/>
+        </w:rPr>
+      </w:pPr>
+      <w:r>
+        <w:rPr>
+          <w:rFonts w:ascii="Segoe UI" w:hAnsi="Segoe UI" w:cs="Segoe UI"/>
+          <w:color w:val="222222"/>
+          <w:shd w:val="clear" w:color="auto" w:fill="FFFFFF"/>
+        </w:rPr>
+        <w:t xml:space="preserve">La </w:t>
+      </w:r>
+      <w:r>
+        <w:rPr>
+          <w:rFonts w:ascii="Segoe UI" w:hAnsi="Segoe UI" w:cs="Segoe UI"/>
+          <w:color w:val="222222"/>
+          <w:shd w:val="clear" w:color="auto" w:fill="FFFFFF"/>
+        </w:rPr>
+        <w:t>stabilité des prix</w:t>
+      </w:r>
+    </w:p>
+    <w:p>
+      <w:pPr>
+        <w:pStyle w:val="Paragraphedeliste"/>
+        <w:numPr>
+          <w:ilvl w:val="0"/>
+          <w:numId w:val="1"/>
+        </w:numPr>
+        <w:tabs>
+          <w:tab w:val="left" w:pos="3915"/>
+        </w:tabs>
+        <w:rPr>
+          <w:kern w:val="0"/>
+          <w:sz w:val="24"/>
+          <w:szCs w:val="24"/>
+          <w14:ligatures w14:val="none"/>
+        </w:rPr>
+      </w:pPr>
+      <w:proofErr w:type="gramStart"/>
+      <w:r>
+        <w:rPr>
+          <w:rFonts w:ascii="Segoe UI" w:hAnsi="Segoe UI" w:cs="Segoe UI"/>
+          <w:color w:val="222222"/>
+          <w:shd w:val="clear" w:color="auto" w:fill="FFFFFF"/>
+        </w:rPr>
+        <w:t>situation</w:t>
+      </w:r>
+      <w:proofErr w:type="gramEnd"/>
+      <w:r>
+        <w:rPr>
+          <w:rFonts w:ascii="Segoe UI" w:hAnsi="Segoe UI" w:cs="Segoe UI"/>
+          <w:color w:val="222222"/>
+          <w:shd w:val="clear" w:color="auto" w:fill="FFFFFF"/>
+        </w:rPr>
+        <w:t xml:space="preserve"> des finances publiques</w:t>
+      </w:r>
+    </w:p>
+    <w:p>
+      <w:pPr>
+        <w:tabs>
+          <w:tab w:val="left" w:pos="3915"/>
+        </w:tabs>
+        <w:rPr>
+          <w:kern w:val="0"/>
+          <w:sz w:val="24"/>
+          <w:szCs w:val="24"/>
+          <w14:ligatures w14:val="none"/>
+        </w:rPr>
+      </w:pPr>
+      <w:r>
+        <w:rPr>
+          <w:kern w:val="0"/>
+          <w:sz w:val="24"/>
+          <w:szCs w:val="24"/>
+          <w14:ligatures w14:val="none"/>
+        </w:rPr>
         <w:t>31 Donnez le rôle de la BCE Banque Centrale Européenne</w:t>
       </w:r>
     </w:p>
@@ -629,6 +1506,29 @@
           <w:szCs w:val="24"/>
           <w14:ligatures w14:val="none"/>
         </w:rPr>
+        <w:t>Le rôle de la BCE est de diriger la politique monétaire de la zone euro et de stabiliser les prix.</w:t>
+      </w:r>
+    </w:p>
+    <w:p>
+      <w:pPr>
+        <w:tabs>
+          <w:tab w:val="left" w:pos="3915"/>
+        </w:tabs>
+        <w:rPr>
+          <w:kern w:val="0"/>
+          <w:sz w:val="24"/>
+          <w:szCs w:val="24"/>
+          <w14:ligatures w14:val="none"/>
+        </w:rPr>
+      </w:pPr>
+      <w:r>
+        <w:rPr>
+          <w:kern w:val="0"/>
+          <w:sz w:val="24"/>
+          <w:szCs w:val="24"/>
+          <w14:ligatures w14:val="none"/>
+        </w:rPr>
+        <w:lastRenderedPageBreak/>
         <w:t>32 Dîtes quelle est l’origine des fonds d’un prêt fait à une entreprise</w:t>
       </w:r>
     </w:p>
@@ -651,6 +1551,48 @@
           <w:szCs w:val="24"/>
           <w14:ligatures w14:val="none"/>
         </w:rPr>
+        <w:t xml:space="preserve">Ce sont les investisseurs qui </w:t>
+      </w:r>
+      <w:proofErr w:type="gramStart"/>
+      <w:r>
+        <w:rPr>
+          <w:kern w:val="0"/>
+          <w:sz w:val="24"/>
+          <w:szCs w:val="24"/>
+          <w14:ligatures w14:val="none"/>
+        </w:rPr>
+        <w:t>prêtes</w:t>
+      </w:r>
+      <w:proofErr w:type="gramEnd"/>
+      <w:r>
+        <w:rPr>
+          <w:kern w:val="0"/>
+          <w:sz w:val="24"/>
+          <w:szCs w:val="24"/>
+          <w14:ligatures w14:val="none"/>
+        </w:rPr>
+        <w:t xml:space="preserve"> de l’argent aux entreprises</w:t>
+      </w:r>
+    </w:p>
+    <w:p>
+      <w:pPr>
+        <w:tabs>
+          <w:tab w:val="left" w:pos="3915"/>
+        </w:tabs>
+        <w:rPr>
+          <w:kern w:val="0"/>
+          <w:sz w:val="24"/>
+          <w:szCs w:val="24"/>
+          <w14:ligatures w14:val="none"/>
+        </w:rPr>
+      </w:pPr>
+      <w:r>
+        <w:rPr>
+          <w:kern w:val="0"/>
+          <w:sz w:val="24"/>
+          <w:szCs w:val="24"/>
+          <w14:ligatures w14:val="none"/>
+        </w:rPr>
         <w:t xml:space="preserve">33 Dîtes quelle est l’origine des fonds d’un prêt fait à un ménage (particulier) </w:t>
       </w:r>
     </w:p>
@@ -666,6 +1608,649 @@
           <w14:ligatures w14:val="none"/>
         </w:rPr>
       </w:pPr>
+      <w:proofErr w:type="gramStart"/>
+      <w:r>
+        <w:rPr>
+          <w:kern w:val="0"/>
+          <w:sz w:val="24"/>
+          <w:szCs w:val="24"/>
+          <w14:ligatures w14:val="none"/>
+        </w:rPr>
+        <w:t>Les fonds reversé</w:t>
+      </w:r>
+      <w:proofErr w:type="gramEnd"/>
+      <w:r>
+        <w:rPr>
+          <w:kern w:val="0"/>
+          <w:sz w:val="24"/>
+          <w:szCs w:val="24"/>
+          <w14:ligatures w14:val="none"/>
+        </w:rPr>
+        <w:t xml:space="preserve"> aux ménages proviennent de la banque centrale, et sont distribué par l’intermédiaire des banque commerciale.</w:t>
+      </w:r>
+    </w:p>
+    <w:p>
+      <w:pPr>
+        <w:tabs>
+          <w:tab w:val="left" w:pos="3915"/>
+        </w:tabs>
+        <w:rPr>
+          <w:kern w:val="0"/>
+          <w:sz w:val="24"/>
+          <w:szCs w:val="24"/>
+          <w14:ligatures w14:val="none"/>
+        </w:rPr>
+      </w:pPr>
+      <w:r>
+        <w:rPr>
+          <w:kern w:val="0"/>
+          <w:sz w:val="24"/>
+          <w:szCs w:val="24"/>
+          <w14:ligatures w14:val="none"/>
+        </w:rPr>
+        <w:t xml:space="preserve">34 Expliquez ce qu’est une AAI Autorité Administrative indépendante </w:t>
+      </w:r>
+    </w:p>
+    <w:p>
+      <w:pPr>
+        <w:tabs>
+          <w:tab w:val="left" w:pos="3915"/>
+        </w:tabs>
+        <w:rPr>
+          <w:kern w:val="0"/>
+          <w:sz w:val="24"/>
+          <w:szCs w:val="24"/>
+          <w14:ligatures w14:val="none"/>
+        </w:rPr>
+      </w:pPr>
+    </w:p>
+    <w:p>
+      <w:pPr>
+        <w:tabs>
+          <w:tab w:val="left" w:pos="3915"/>
+        </w:tabs>
+        <w:rPr>
+          <w:kern w:val="0"/>
+          <w:sz w:val="24"/>
+          <w:szCs w:val="24"/>
+          <w14:ligatures w14:val="none"/>
+        </w:rPr>
+      </w:pPr>
+      <w:r>
+        <w:rPr>
+          <w:kern w:val="0"/>
+          <w:sz w:val="24"/>
+          <w:szCs w:val="24"/>
+          <w14:ligatures w14:val="none"/>
+        </w:rPr>
+        <w:t>35 Expliquez ce qu’est, en droit, une règle supplétive</w:t>
+      </w:r>
+    </w:p>
+    <w:p>
+      <w:pPr>
+        <w:tabs>
+          <w:tab w:val="left" w:pos="3915"/>
+        </w:tabs>
+        <w:rPr>
+          <w:kern w:val="0"/>
+          <w:sz w:val="24"/>
+          <w:szCs w:val="24"/>
+          <w14:ligatures w14:val="none"/>
+        </w:rPr>
+      </w:pPr>
+      <w:r>
+        <w:rPr>
+          <w:kern w:val="0"/>
+          <w:sz w:val="24"/>
+          <w:szCs w:val="24"/>
+          <w14:ligatures w14:val="none"/>
+        </w:rPr>
+        <w:t xml:space="preserve">Une </w:t>
+      </w:r>
+      <w:proofErr w:type="spellStart"/>
+      <w:r>
+        <w:rPr>
+          <w:kern w:val="0"/>
+          <w:sz w:val="24"/>
+          <w:szCs w:val="24"/>
+          <w14:ligatures w14:val="none"/>
+        </w:rPr>
+        <w:t>regle</w:t>
+      </w:r>
+      <w:proofErr w:type="spellEnd"/>
+      <w:r>
+        <w:rPr>
+          <w:kern w:val="0"/>
+          <w:sz w:val="24"/>
+          <w:szCs w:val="24"/>
+          <w14:ligatures w14:val="none"/>
+        </w:rPr>
+        <w:t xml:space="preserve"> supplétive est une </w:t>
+      </w:r>
+      <w:proofErr w:type="spellStart"/>
+      <w:r>
+        <w:rPr>
+          <w:kern w:val="0"/>
+          <w:sz w:val="24"/>
+          <w:szCs w:val="24"/>
+          <w14:ligatures w14:val="none"/>
+        </w:rPr>
+        <w:t>regle</w:t>
+      </w:r>
+      <w:proofErr w:type="spellEnd"/>
+      <w:r>
+        <w:rPr>
+          <w:kern w:val="0"/>
+          <w:sz w:val="24"/>
+          <w:szCs w:val="24"/>
+          <w14:ligatures w14:val="none"/>
+        </w:rPr>
+        <w:t xml:space="preserve"> d’ordre publique qui s’applique si aucun des parties ne se mets d’accord</w:t>
+      </w:r>
+    </w:p>
+    <w:p>
+      <w:pPr>
+        <w:tabs>
+          <w:tab w:val="left" w:pos="3915"/>
+        </w:tabs>
+        <w:rPr>
+          <w:kern w:val="0"/>
+          <w:sz w:val="24"/>
+          <w:szCs w:val="24"/>
+          <w14:ligatures w14:val="none"/>
+        </w:rPr>
+      </w:pPr>
+      <w:r>
+        <w:rPr>
+          <w:kern w:val="0"/>
+          <w:sz w:val="24"/>
+          <w:szCs w:val="24"/>
+          <w14:ligatures w14:val="none"/>
+        </w:rPr>
+        <w:t xml:space="preserve">36 Expliquez ce qu’est, en droit, une règle impérative </w:t>
+      </w:r>
+    </w:p>
+    <w:p>
+      <w:pPr>
+        <w:tabs>
+          <w:tab w:val="left" w:pos="3915"/>
+        </w:tabs>
+        <w:rPr>
+          <w:kern w:val="0"/>
+          <w:sz w:val="24"/>
+          <w:szCs w:val="24"/>
+          <w14:ligatures w14:val="none"/>
+        </w:rPr>
+      </w:pPr>
+      <w:proofErr w:type="spellStart"/>
+      <w:r>
+        <w:rPr>
+          <w:kern w:val="0"/>
+          <w:sz w:val="24"/>
+          <w:szCs w:val="24"/>
+          <w14:ligatures w14:val="none"/>
+        </w:rPr>
+        <w:t>Regle</w:t>
+      </w:r>
+      <w:proofErr w:type="spellEnd"/>
+      <w:r>
+        <w:rPr>
+          <w:kern w:val="0"/>
+          <w:sz w:val="24"/>
+          <w:szCs w:val="24"/>
+          <w14:ligatures w14:val="none"/>
+        </w:rPr>
+        <w:t xml:space="preserve"> d’ordre publique s’</w:t>
+      </w:r>
+      <w:proofErr w:type="spellStart"/>
+      <w:r>
+        <w:rPr>
+          <w:kern w:val="0"/>
+          <w:sz w:val="24"/>
+          <w:szCs w:val="24"/>
+          <w14:ligatures w14:val="none"/>
+        </w:rPr>
+        <w:t>applicant</w:t>
+      </w:r>
+      <w:proofErr w:type="spellEnd"/>
+      <w:r>
+        <w:rPr>
+          <w:kern w:val="0"/>
+          <w:sz w:val="24"/>
+          <w:szCs w:val="24"/>
+          <w14:ligatures w14:val="none"/>
+        </w:rPr>
+        <w:t xml:space="preserve"> même si les parties ont trouvé un accord afin d’éviter des soucis économique et/ou sociale</w:t>
+      </w:r>
+    </w:p>
+    <w:p>
+      <w:pPr>
+        <w:tabs>
+          <w:tab w:val="left" w:pos="3915"/>
+        </w:tabs>
+        <w:rPr>
+          <w:kern w:val="0"/>
+          <w:sz w:val="24"/>
+          <w:szCs w:val="24"/>
+          <w14:ligatures w14:val="none"/>
+        </w:rPr>
+      </w:pPr>
+      <w:r>
+        <w:rPr>
+          <w:kern w:val="0"/>
+          <w:sz w:val="24"/>
+          <w:szCs w:val="24"/>
+          <w14:ligatures w14:val="none"/>
+        </w:rPr>
+        <w:t xml:space="preserve">37 Donnez des exemples d’AAI </w:t>
+      </w:r>
+    </w:p>
+    <w:p>
+      <w:pPr>
+        <w:tabs>
+          <w:tab w:val="left" w:pos="3915"/>
+        </w:tabs>
+        <w:rPr>
+          <w:kern w:val="0"/>
+          <w:sz w:val="24"/>
+          <w:szCs w:val="24"/>
+          <w14:ligatures w14:val="none"/>
+        </w:rPr>
+      </w:pPr>
+      <w:r>
+        <w:rPr>
+          <w:kern w:val="0"/>
+          <w:sz w:val="24"/>
+          <w:szCs w:val="24"/>
+          <w14:ligatures w14:val="none"/>
+        </w:rPr>
+        <w:t>La CNIL, l’AMF ou encore l’ARCEP sont des AAI</w:t>
+      </w:r>
+    </w:p>
+    <w:p>
+      <w:pPr>
+        <w:tabs>
+          <w:tab w:val="left" w:pos="3915"/>
+        </w:tabs>
+        <w:rPr>
+          <w:kern w:val="0"/>
+          <w:sz w:val="24"/>
+          <w:szCs w:val="24"/>
+          <w14:ligatures w14:val="none"/>
+        </w:rPr>
+      </w:pPr>
+      <w:r>
+        <w:rPr>
+          <w:kern w:val="0"/>
+          <w:sz w:val="24"/>
+          <w:szCs w:val="24"/>
+          <w14:ligatures w14:val="none"/>
+        </w:rPr>
+        <w:t>38 Listez les actes de concurrence déloyale et expliquez en quoi ils consistent (4 au minimum)</w:t>
+      </w:r>
+    </w:p>
+    <w:p>
+      <w:pPr>
+        <w:tabs>
+          <w:tab w:val="left" w:pos="3915"/>
+        </w:tabs>
+        <w:rPr>
+          <w:kern w:val="0"/>
+          <w:sz w:val="24"/>
+          <w:szCs w:val="24"/>
+          <w14:ligatures w14:val="none"/>
+        </w:rPr>
+      </w:pPr>
+      <w:r>
+        <w:rPr>
+          <w:kern w:val="0"/>
+          <w:sz w:val="24"/>
+          <w:szCs w:val="24"/>
+          <w14:ligatures w14:val="none"/>
+        </w:rPr>
+        <w:t>En actes de concurrence déloyal il y a :</w:t>
+      </w:r>
+    </w:p>
+    <w:p>
+      <w:pPr>
+        <w:pStyle w:val="Paragraphedeliste"/>
+        <w:numPr>
+          <w:ilvl w:val="0"/>
+          <w:numId w:val="1"/>
+        </w:numPr>
+        <w:tabs>
+          <w:tab w:val="left" w:pos="3915"/>
+        </w:tabs>
+        <w:rPr>
+          <w:kern w:val="0"/>
+          <w:sz w:val="24"/>
+          <w:szCs w:val="24"/>
+          <w14:ligatures w14:val="none"/>
+        </w:rPr>
+      </w:pPr>
+      <w:r>
+        <w:rPr>
+          <w:kern w:val="0"/>
+          <w:sz w:val="24"/>
+          <w:szCs w:val="24"/>
+          <w14:ligatures w14:val="none"/>
+        </w:rPr>
+        <w:t xml:space="preserve">Le </w:t>
+      </w:r>
+      <w:r>
+        <w:rPr>
+          <w:rFonts w:ascii="Segoe UI" w:hAnsi="Segoe UI" w:cs="Segoe UI"/>
+          <w:color w:val="222222"/>
+          <w:shd w:val="clear" w:color="auto" w:fill="FFFFFF"/>
+        </w:rPr>
+        <w:t>dénigrement</w:t>
+      </w:r>
+      <w:r>
+        <w:rPr>
+          <w:rFonts w:ascii="Segoe UI" w:hAnsi="Segoe UI" w:cs="Segoe UI"/>
+          <w:color w:val="222222"/>
+          <w:shd w:val="clear" w:color="auto" w:fill="FFFFFF"/>
+        </w:rPr>
+        <w:t> : C’est une diffusion publique d’informations pouvant dénigrer l’image de la marque</w:t>
+      </w:r>
+    </w:p>
+    <w:p>
+      <w:pPr>
+        <w:pStyle w:val="Paragraphedeliste"/>
+        <w:numPr>
+          <w:ilvl w:val="0"/>
+          <w:numId w:val="1"/>
+        </w:numPr>
+        <w:tabs>
+          <w:tab w:val="left" w:pos="3915"/>
+        </w:tabs>
+        <w:rPr>
+          <w:kern w:val="0"/>
+          <w:sz w:val="24"/>
+          <w:szCs w:val="24"/>
+          <w14:ligatures w14:val="none"/>
+        </w:rPr>
+      </w:pPr>
+      <w:r>
+        <w:rPr>
+          <w:rFonts w:ascii="Segoe UI" w:hAnsi="Segoe UI" w:cs="Segoe UI"/>
+          <w:color w:val="222222"/>
+          <w:shd w:val="clear" w:color="auto" w:fill="FFFFFF"/>
+        </w:rPr>
+        <w:t xml:space="preserve">Le </w:t>
+      </w:r>
+      <w:r>
+        <w:rPr>
+          <w:rFonts w:ascii="Segoe UI" w:hAnsi="Segoe UI" w:cs="Segoe UI"/>
+          <w:color w:val="222222"/>
+          <w:shd w:val="clear" w:color="auto" w:fill="FFFFFF"/>
+        </w:rPr>
+        <w:t>détournement de clientèle</w:t>
+      </w:r>
+      <w:r>
+        <w:rPr>
+          <w:rFonts w:ascii="Segoe UI" w:hAnsi="Segoe UI" w:cs="Segoe UI"/>
+          <w:color w:val="222222"/>
+          <w:shd w:val="clear" w:color="auto" w:fill="FFFFFF"/>
+        </w:rPr>
+        <w:t xml:space="preserve"> : L’entreprise utilise </w:t>
+      </w:r>
+      <w:proofErr w:type="gramStart"/>
+      <w:r>
+        <w:rPr>
+          <w:rFonts w:ascii="Segoe UI" w:hAnsi="Segoe UI" w:cs="Segoe UI"/>
+          <w:color w:val="222222"/>
+          <w:shd w:val="clear" w:color="auto" w:fill="FFFFFF"/>
+        </w:rPr>
+        <w:t>des techniques déloyal</w:t>
+      </w:r>
+      <w:proofErr w:type="gramEnd"/>
+      <w:r>
+        <w:rPr>
+          <w:rFonts w:ascii="Segoe UI" w:hAnsi="Segoe UI" w:cs="Segoe UI"/>
+          <w:color w:val="222222"/>
+          <w:shd w:val="clear" w:color="auto" w:fill="FFFFFF"/>
+        </w:rPr>
+        <w:t xml:space="preserve"> comme le </w:t>
+      </w:r>
+      <w:proofErr w:type="spellStart"/>
+      <w:r>
+        <w:rPr>
+          <w:rFonts w:ascii="Segoe UI" w:hAnsi="Segoe UI" w:cs="Segoe UI"/>
+          <w:color w:val="222222"/>
+          <w:shd w:val="clear" w:color="auto" w:fill="FFFFFF"/>
+        </w:rPr>
+        <w:t>typosquatting</w:t>
+      </w:r>
+      <w:proofErr w:type="spellEnd"/>
+      <w:r>
+        <w:rPr>
+          <w:rFonts w:ascii="Segoe UI" w:hAnsi="Segoe UI" w:cs="Segoe UI"/>
+          <w:color w:val="222222"/>
+          <w:shd w:val="clear" w:color="auto" w:fill="FFFFFF"/>
+        </w:rPr>
+        <w:t xml:space="preserve"> pour capter les clients de sa concurrence</w:t>
+      </w:r>
+    </w:p>
+    <w:p>
+      <w:pPr>
+        <w:pStyle w:val="Paragraphedeliste"/>
+        <w:numPr>
+          <w:ilvl w:val="0"/>
+          <w:numId w:val="1"/>
+        </w:numPr>
+        <w:tabs>
+          <w:tab w:val="left" w:pos="3915"/>
+        </w:tabs>
+        <w:rPr>
+          <w:kern w:val="0"/>
+          <w:sz w:val="24"/>
+          <w:szCs w:val="24"/>
+          <w14:ligatures w14:val="none"/>
+        </w:rPr>
+      </w:pPr>
+      <w:r>
+        <w:rPr>
+          <w:rFonts w:ascii="Segoe UI" w:hAnsi="Segoe UI" w:cs="Segoe UI"/>
+          <w:color w:val="222222"/>
+          <w:shd w:val="clear" w:color="auto" w:fill="FFFFFF"/>
+        </w:rPr>
+        <w:t xml:space="preserve">La </w:t>
+      </w:r>
+      <w:r>
+        <w:rPr>
+          <w:rFonts w:ascii="Segoe UI" w:hAnsi="Segoe UI" w:cs="Segoe UI"/>
+          <w:color w:val="222222"/>
+          <w:shd w:val="clear" w:color="auto" w:fill="FFFFFF"/>
+        </w:rPr>
+        <w:t>désorganisation</w:t>
+      </w:r>
+      <w:r>
+        <w:rPr>
+          <w:rFonts w:ascii="Segoe UI" w:hAnsi="Segoe UI" w:cs="Segoe UI"/>
+          <w:color w:val="222222"/>
+          <w:shd w:val="clear" w:color="auto" w:fill="FFFFFF"/>
+        </w:rPr>
+        <w:t> : Débauche des salariés de l’un de ses concurrents</w:t>
+      </w:r>
+    </w:p>
+    <w:p>
+      <w:pPr>
+        <w:pStyle w:val="Paragraphedeliste"/>
+        <w:numPr>
+          <w:ilvl w:val="0"/>
+          <w:numId w:val="1"/>
+        </w:numPr>
+        <w:tabs>
+          <w:tab w:val="left" w:pos="3915"/>
+        </w:tabs>
+        <w:rPr>
+          <w:kern w:val="0"/>
+          <w:sz w:val="24"/>
+          <w:szCs w:val="24"/>
+          <w14:ligatures w14:val="none"/>
+        </w:rPr>
+      </w:pPr>
+      <w:r>
+        <w:rPr>
+          <w:rFonts w:ascii="Segoe UI" w:hAnsi="Segoe UI" w:cs="Segoe UI"/>
+          <w:color w:val="222222"/>
+          <w:shd w:val="clear" w:color="auto" w:fill="FFFFFF"/>
+        </w:rPr>
+        <w:t xml:space="preserve">Le </w:t>
+      </w:r>
+      <w:r>
+        <w:rPr>
+          <w:rFonts w:ascii="Segoe UI" w:hAnsi="Segoe UI" w:cs="Segoe UI"/>
+          <w:color w:val="222222"/>
+          <w:shd w:val="clear" w:color="auto" w:fill="FFFFFF"/>
+        </w:rPr>
+        <w:t>parasitisme</w:t>
+      </w:r>
+      <w:r>
+        <w:rPr>
+          <w:rFonts w:ascii="Segoe UI" w:hAnsi="Segoe UI" w:cs="Segoe UI"/>
+          <w:color w:val="222222"/>
+          <w:shd w:val="clear" w:color="auto" w:fill="FFFFFF"/>
+        </w:rPr>
+        <w:t> : C’est lorsqu’une entreprise profite des efforts de la concurrence sans pour autant être considérer comme une contrefaçon</w:t>
+      </w:r>
+    </w:p>
+    <w:p>
+      <w:pPr>
+        <w:tabs>
+          <w:tab w:val="left" w:pos="3915"/>
+        </w:tabs>
+        <w:rPr>
+          <w:kern w:val="0"/>
+          <w:sz w:val="24"/>
+          <w:szCs w:val="24"/>
+          <w14:ligatures w14:val="none"/>
+        </w:rPr>
+      </w:pPr>
+    </w:p>
+    <w:p>
+      <w:pPr>
+        <w:tabs>
+          <w:tab w:val="left" w:pos="3915"/>
+        </w:tabs>
+        <w:rPr>
+          <w:kern w:val="0"/>
+          <w:sz w:val="24"/>
+          <w:szCs w:val="24"/>
+          <w14:ligatures w14:val="none"/>
+        </w:rPr>
+      </w:pPr>
+      <w:r>
+        <w:rPr>
+          <w:kern w:val="0"/>
+          <w:sz w:val="24"/>
+          <w:szCs w:val="24"/>
+          <w14:ligatures w14:val="none"/>
+        </w:rPr>
+        <w:t>39 Expliquez le principe de l’interdiction des « prix abusivement bas »</w:t>
+      </w:r>
+    </w:p>
+    <w:p>
+      <w:pPr>
+        <w:tabs>
+          <w:tab w:val="left" w:pos="3915"/>
+        </w:tabs>
+        <w:rPr>
+          <w:kern w:val="0"/>
+          <w:sz w:val="24"/>
+          <w:szCs w:val="24"/>
+          <w14:ligatures w14:val="none"/>
+        </w:rPr>
+      </w:pPr>
+      <w:r>
+        <w:rPr>
+          <w:kern w:val="0"/>
+          <w:sz w:val="24"/>
+          <w:szCs w:val="24"/>
+          <w14:ligatures w14:val="none"/>
+        </w:rPr>
+        <w:t>Il est interdit de vendre un produit a perte, ou de mettre le prix en deçà de son prix de production</w:t>
+      </w:r>
+    </w:p>
+    <w:p>
+      <w:pPr>
+        <w:tabs>
+          <w:tab w:val="left" w:pos="3915"/>
+        </w:tabs>
+        <w:rPr>
+          <w:kern w:val="0"/>
+          <w:sz w:val="24"/>
+          <w:szCs w:val="24"/>
+          <w14:ligatures w14:val="none"/>
+        </w:rPr>
+      </w:pPr>
+      <w:r>
+        <w:rPr>
+          <w:kern w:val="0"/>
+          <w:sz w:val="24"/>
+          <w:szCs w:val="24"/>
+          <w14:ligatures w14:val="none"/>
+        </w:rPr>
+        <w:t>40 Pratiques anti-concurrentielles : expliquez les « concentrations »</w:t>
+      </w:r>
+    </w:p>
+    <w:p>
+      <w:pPr>
+        <w:tabs>
+          <w:tab w:val="left" w:pos="3915"/>
+        </w:tabs>
+        <w:rPr>
+          <w:kern w:val="0"/>
+          <w:sz w:val="24"/>
+          <w:szCs w:val="24"/>
+          <w14:ligatures w14:val="none"/>
+        </w:rPr>
+      </w:pPr>
+      <w:r>
+        <w:rPr>
+          <w:kern w:val="0"/>
+          <w:sz w:val="24"/>
+          <w:szCs w:val="24"/>
+          <w14:ligatures w14:val="none"/>
+        </w:rPr>
+        <w:t>Les concentrations consiste en l’absorption ou la fusion de plusieurs entreprises. Si l’entreprise final prend une trop grande par du marché cela peut conduire à un monopole</w:t>
+      </w:r>
+    </w:p>
+    <w:p>
+      <w:pPr>
+        <w:tabs>
+          <w:tab w:val="left" w:pos="3915"/>
+        </w:tabs>
+        <w:rPr>
+          <w:kern w:val="0"/>
+          <w:sz w:val="24"/>
+          <w:szCs w:val="24"/>
+          <w14:ligatures w14:val="none"/>
+        </w:rPr>
+      </w:pPr>
+      <w:r>
+        <w:rPr>
+          <w:kern w:val="0"/>
+          <w:sz w:val="24"/>
+          <w:szCs w:val="24"/>
+          <w14:ligatures w14:val="none"/>
+        </w:rPr>
+        <w:t>41 Pratiques anti-concurrentielles : expliquez les « ententes illicites » (ou cartels, ou collusions)</w:t>
+      </w:r>
+    </w:p>
+    <w:p>
+      <w:pPr>
+        <w:tabs>
+          <w:tab w:val="left" w:pos="3915"/>
+        </w:tabs>
+        <w:rPr>
+          <w:kern w:val="0"/>
+          <w:sz w:val="24"/>
+          <w:szCs w:val="24"/>
+          <w14:ligatures w14:val="none"/>
+        </w:rPr>
+      </w:pPr>
       <w:r>
         <w:rPr>
           <w:kern w:val="0"/>
@@ -674,161 +2259,27 @@
           <w14:ligatures w14:val="none"/>
         </w:rPr>
         <w:lastRenderedPageBreak/>
-        <w:t xml:space="preserve">34 Expliquez ce qu’est une AAI Autorité Administrative indépendante </w:t>
-      </w:r>
-    </w:p>
-    <w:p>
-      <w:pPr>
-        <w:tabs>
-          <w:tab w:val="left" w:pos="3915"/>
-        </w:tabs>
-        <w:rPr>
-          <w:kern w:val="0"/>
-          <w:sz w:val="24"/>
-          <w:szCs w:val="24"/>
-          <w14:ligatures w14:val="none"/>
-        </w:rPr>
-      </w:pPr>
-      <w:r>
-        <w:rPr>
-          <w:kern w:val="0"/>
-          <w:sz w:val="24"/>
-          <w:szCs w:val="24"/>
-          <w14:ligatures w14:val="none"/>
-        </w:rPr>
-        <w:t>35 Expliquez ce qu’est, en droit, une règle supplétive</w:t>
-      </w:r>
-    </w:p>
-    <w:p>
-      <w:pPr>
-        <w:tabs>
-          <w:tab w:val="left" w:pos="3915"/>
-        </w:tabs>
-        <w:rPr>
-          <w:kern w:val="0"/>
-          <w:sz w:val="24"/>
-          <w:szCs w:val="24"/>
-          <w14:ligatures w14:val="none"/>
-        </w:rPr>
-      </w:pPr>
-      <w:r>
-        <w:rPr>
-          <w:kern w:val="0"/>
-          <w:sz w:val="24"/>
-          <w:szCs w:val="24"/>
-          <w14:ligatures w14:val="none"/>
-        </w:rPr>
-        <w:t xml:space="preserve">36 Expliquez ce qu’est, en droit, une règle impérative </w:t>
-      </w:r>
-    </w:p>
-    <w:p>
-      <w:pPr>
-        <w:tabs>
-          <w:tab w:val="left" w:pos="3915"/>
-        </w:tabs>
-        <w:rPr>
-          <w:kern w:val="0"/>
-          <w:sz w:val="24"/>
-          <w:szCs w:val="24"/>
-          <w14:ligatures w14:val="none"/>
-        </w:rPr>
-      </w:pPr>
-      <w:r>
-        <w:rPr>
-          <w:kern w:val="0"/>
-          <w:sz w:val="24"/>
-          <w:szCs w:val="24"/>
-          <w14:ligatures w14:val="none"/>
-        </w:rPr>
-        <w:t xml:space="preserve">37 Donnez des exemples d’AAI </w:t>
-      </w:r>
-    </w:p>
-    <w:p>
-      <w:pPr>
-        <w:tabs>
-          <w:tab w:val="left" w:pos="3915"/>
-        </w:tabs>
-        <w:rPr>
-          <w:kern w:val="0"/>
-          <w:sz w:val="24"/>
-          <w:szCs w:val="24"/>
-          <w14:ligatures w14:val="none"/>
-        </w:rPr>
-      </w:pPr>
-      <w:r>
-        <w:rPr>
-          <w:kern w:val="0"/>
-          <w:sz w:val="24"/>
-          <w:szCs w:val="24"/>
-          <w14:ligatures w14:val="none"/>
-        </w:rPr>
-        <w:t>38 Listez les actes de concurrence déloyale et expliquez en quoi ils consistent (4 au minimum)</w:t>
-      </w:r>
-    </w:p>
-    <w:p>
-      <w:pPr>
-        <w:tabs>
-          <w:tab w:val="left" w:pos="3915"/>
-        </w:tabs>
-        <w:rPr>
-          <w:kern w:val="0"/>
-          <w:sz w:val="24"/>
-          <w:szCs w:val="24"/>
-          <w14:ligatures w14:val="none"/>
-        </w:rPr>
-      </w:pPr>
-      <w:r>
-        <w:rPr>
-          <w:kern w:val="0"/>
-          <w:sz w:val="24"/>
-          <w:szCs w:val="24"/>
-          <w14:ligatures w14:val="none"/>
-        </w:rPr>
-        <w:t>39 Expliquez le principe de l’interdiction des « prix abusivement bas »</w:t>
-      </w:r>
-    </w:p>
-    <w:p>
-      <w:pPr>
-        <w:tabs>
-          <w:tab w:val="left" w:pos="3915"/>
-        </w:tabs>
-        <w:rPr>
-          <w:kern w:val="0"/>
-          <w:sz w:val="24"/>
-          <w:szCs w:val="24"/>
-          <w14:ligatures w14:val="none"/>
-        </w:rPr>
-      </w:pPr>
-      <w:r>
-        <w:rPr>
-          <w:kern w:val="0"/>
-          <w:sz w:val="24"/>
-          <w:szCs w:val="24"/>
-          <w14:ligatures w14:val="none"/>
-        </w:rPr>
-        <w:t>40 Pratiques anti-concurrentielles : expliquez les « concentrations »</w:t>
-      </w:r>
-    </w:p>
-    <w:p>
-      <w:pPr>
-        <w:tabs>
-          <w:tab w:val="left" w:pos="3915"/>
-        </w:tabs>
-        <w:rPr>
-          <w:kern w:val="0"/>
-          <w:sz w:val="24"/>
-          <w:szCs w:val="24"/>
-          <w14:ligatures w14:val="none"/>
-        </w:rPr>
-      </w:pPr>
-      <w:r>
-        <w:rPr>
-          <w:kern w:val="0"/>
-          <w:sz w:val="24"/>
-          <w:szCs w:val="24"/>
-          <w14:ligatures w14:val="none"/>
-        </w:rPr>
-        <w:t>41 Pratiques anti-concurrentielles : expliquez les « ententes illicites » (ou cartels, ou collusions)</w:t>
+        <w:t xml:space="preserve">Les ententes illicites sont des accords entre concurrent visant à arrêter la libre concurrence et mettent par exemple des prix abusivement haut ou en créant des barrières </w:t>
+      </w:r>
+      <w:proofErr w:type="spellStart"/>
+      <w:r>
+        <w:rPr>
+          <w:kern w:val="0"/>
+          <w:sz w:val="24"/>
+          <w:szCs w:val="24"/>
+          <w14:ligatures w14:val="none"/>
+        </w:rPr>
+        <w:t>a</w:t>
+      </w:r>
+      <w:proofErr w:type="spellEnd"/>
+      <w:r>
+        <w:rPr>
+          <w:kern w:val="0"/>
+          <w:sz w:val="24"/>
+          <w:szCs w:val="24"/>
+          <w14:ligatures w14:val="none"/>
+        </w:rPr>
+        <w:t xml:space="preserve"> l’entrée</w:t>
       </w:r>
     </w:p>
     <w:p>
@@ -872,6 +2323,28 @@
           <w:szCs w:val="24"/>
           <w14:ligatures w14:val="none"/>
         </w:rPr>
+        <w:t>Lorsqu’une entreprise abuse de son pouvoir pour modifier les règles du marché via sa position dominante, c’est une pratique anti-concurrentielle</w:t>
+      </w:r>
+    </w:p>
+    <w:p>
+      <w:pPr>
+        <w:tabs>
+          <w:tab w:val="left" w:pos="3915"/>
+        </w:tabs>
+        <w:rPr>
+          <w:kern w:val="0"/>
+          <w:sz w:val="24"/>
+          <w:szCs w:val="24"/>
+          <w14:ligatures w14:val="none"/>
+        </w:rPr>
+      </w:pPr>
+      <w:r>
+        <w:rPr>
+          <w:kern w:val="0"/>
+          <w:sz w:val="24"/>
+          <w:szCs w:val="24"/>
+          <w14:ligatures w14:val="none"/>
+        </w:rPr>
         <w:t>43 Dîtes pour combien de temps peut être déposé un brevet, et si le dépôt est renouvelable</w:t>
       </w:r>
     </w:p>
@@ -894,6 +2367,28 @@
           <w:szCs w:val="24"/>
           <w14:ligatures w14:val="none"/>
         </w:rPr>
+        <w:t>Un brevet peut être déposer pendant 20 ans, son dépôt n’est pas renouvelable</w:t>
+      </w:r>
+    </w:p>
+    <w:p>
+      <w:pPr>
+        <w:tabs>
+          <w:tab w:val="left" w:pos="3915"/>
+        </w:tabs>
+        <w:rPr>
+          <w:kern w:val="0"/>
+          <w:sz w:val="24"/>
+          <w:szCs w:val="24"/>
+          <w14:ligatures w14:val="none"/>
+        </w:rPr>
+      </w:pPr>
+      <w:r>
+        <w:rPr>
+          <w:kern w:val="0"/>
+          <w:sz w:val="24"/>
+          <w:szCs w:val="24"/>
+          <w14:ligatures w14:val="none"/>
+        </w:rPr>
         <w:t>44 Dîtes pour combien de temps peut être déposé une marque (en France et en Europe) et si son dépôt est renouvelable</w:t>
       </w:r>
     </w:p>
@@ -916,6 +2411,28 @@
           <w:szCs w:val="24"/>
           <w14:ligatures w14:val="none"/>
         </w:rPr>
+        <w:t>En France et en Europe une marque peut être déposer pendant 10 ans et être renouveler autant de fois que voulu</w:t>
+      </w:r>
+    </w:p>
+    <w:p>
+      <w:pPr>
+        <w:tabs>
+          <w:tab w:val="left" w:pos="3915"/>
+        </w:tabs>
+        <w:rPr>
+          <w:kern w:val="0"/>
+          <w:sz w:val="24"/>
+          <w:szCs w:val="24"/>
+          <w14:ligatures w14:val="none"/>
+        </w:rPr>
+      </w:pPr>
+      <w:r>
+        <w:rPr>
+          <w:kern w:val="0"/>
+          <w:sz w:val="24"/>
+          <w:szCs w:val="24"/>
+          <w14:ligatures w14:val="none"/>
+        </w:rPr>
         <w:t>45 Dîtes pour combien de temps peut être déposé une marque (pour le Monde) et si son dépôt est renouvelable</w:t>
       </w:r>
     </w:p>
@@ -938,6 +2455,28 @@
           <w:szCs w:val="24"/>
           <w14:ligatures w14:val="none"/>
         </w:rPr>
+        <w:t>Dans le monde, une marque peut être déposé pour 20 ans et être renouvelé autant de fois que voulu</w:t>
+      </w:r>
+    </w:p>
+    <w:p>
+      <w:pPr>
+        <w:tabs>
+          <w:tab w:val="left" w:pos="3915"/>
+        </w:tabs>
+        <w:rPr>
+          <w:kern w:val="0"/>
+          <w:sz w:val="24"/>
+          <w:szCs w:val="24"/>
+          <w14:ligatures w14:val="none"/>
+        </w:rPr>
+      </w:pPr>
+      <w:r>
+        <w:rPr>
+          <w:kern w:val="0"/>
+          <w:sz w:val="24"/>
+          <w:szCs w:val="24"/>
+          <w14:ligatures w14:val="none"/>
+        </w:rPr>
         <w:t>46 Dîtes quel est le rôle essentiel de l’INPI Institut National de la Propriété industrielle</w:t>
       </w:r>
     </w:p>
@@ -960,7 +2499,113 @@
           <w:szCs w:val="24"/>
           <w14:ligatures w14:val="none"/>
         </w:rPr>
-        <w:t xml:space="preserve">47 Dîtes quel est le rôle de l’OHMI Office de l’Harmonisation dans le Marché Intérieur </w:t>
+        <w:t xml:space="preserve">Gérer les brevet et Marque déposer </w:t>
+      </w:r>
+      <w:proofErr w:type="spellStart"/>
+      <w:proofErr w:type="gramStart"/>
+      <w:r>
+        <w:rPr>
+          <w:kern w:val="0"/>
+          <w:sz w:val="24"/>
+          <w:szCs w:val="24"/>
+          <w14:ligatures w14:val="none"/>
+        </w:rPr>
+        <w:t>a</w:t>
+      </w:r>
+      <w:proofErr w:type="spellEnd"/>
+      <w:proofErr w:type="gramEnd"/>
+      <w:r>
+        <w:rPr>
+          <w:kern w:val="0"/>
+          <w:sz w:val="24"/>
+          <w:szCs w:val="24"/>
+          <w14:ligatures w14:val="none"/>
+        </w:rPr>
+        <w:t xml:space="preserve"> l’échelle de la France</w:t>
+      </w:r>
+    </w:p>
+    <w:p>
+      <w:pPr>
+        <w:tabs>
+          <w:tab w:val="left" w:pos="3915"/>
+        </w:tabs>
+        <w:rPr>
+          <w:kern w:val="0"/>
+          <w:sz w:val="24"/>
+          <w:szCs w:val="24"/>
+          <w14:ligatures w14:val="none"/>
+        </w:rPr>
+      </w:pPr>
+      <w:r>
+        <w:rPr>
+          <w:kern w:val="0"/>
+          <w:sz w:val="24"/>
+          <w:szCs w:val="24"/>
+          <w14:ligatures w14:val="none"/>
+        </w:rPr>
+        <w:t>47 Dîtes quel est le rôle de l’OHMI Office de l’Harmonisation dans le Marché Intérieur</w:t>
+      </w:r>
+    </w:p>
+    <w:p>
+      <w:pPr>
+        <w:tabs>
+          <w:tab w:val="left" w:pos="3915"/>
+        </w:tabs>
+        <w:rPr>
+          <w:kern w:val="0"/>
+          <w:sz w:val="24"/>
+          <w:szCs w:val="24"/>
+          <w14:ligatures w14:val="none"/>
+        </w:rPr>
+      </w:pPr>
+      <w:r>
+        <w:rPr>
+          <w:kern w:val="0"/>
+          <w:sz w:val="24"/>
+          <w:szCs w:val="24"/>
+          <w14:ligatures w14:val="none"/>
+        </w:rPr>
+        <w:t xml:space="preserve">Gérer les brevet et Marque déposer </w:t>
+      </w:r>
+      <w:proofErr w:type="spellStart"/>
+      <w:proofErr w:type="gramStart"/>
+      <w:r>
+        <w:rPr>
+          <w:kern w:val="0"/>
+          <w:sz w:val="24"/>
+          <w:szCs w:val="24"/>
+          <w14:ligatures w14:val="none"/>
+        </w:rPr>
+        <w:t>a</w:t>
+      </w:r>
+      <w:proofErr w:type="spellEnd"/>
+      <w:proofErr w:type="gramEnd"/>
+      <w:r>
+        <w:rPr>
+          <w:kern w:val="0"/>
+          <w:sz w:val="24"/>
+          <w:szCs w:val="24"/>
+          <w14:ligatures w14:val="none"/>
+        </w:rPr>
+        <w:t xml:space="preserve"> l’échelle de l</w:t>
+      </w:r>
+      <w:r>
+        <w:rPr>
+          <w:kern w:val="0"/>
+          <w:sz w:val="24"/>
+          <w:szCs w:val="24"/>
+          <w14:ligatures w14:val="none"/>
+        </w:rPr>
+        <w:t>’Europe</w:t>
+      </w:r>
+      <w:r>
+        <w:rPr>
+          <w:kern w:val="0"/>
+          <w:sz w:val="24"/>
+          <w:szCs w:val="24"/>
+          <w14:ligatures w14:val="none"/>
+        </w:rPr>
+        <w:t xml:space="preserve"> </w:t>
       </w:r>
     </w:p>
     <w:p>
@@ -1004,6 +2649,59 @@
           <w:szCs w:val="24"/>
           <w14:ligatures w14:val="none"/>
         </w:rPr>
+        <w:t xml:space="preserve">Gérer les brevet et Marque déposer </w:t>
+      </w:r>
+      <w:proofErr w:type="spellStart"/>
+      <w:proofErr w:type="gramStart"/>
+      <w:r>
+        <w:rPr>
+          <w:kern w:val="0"/>
+          <w:sz w:val="24"/>
+          <w:szCs w:val="24"/>
+          <w14:ligatures w14:val="none"/>
+        </w:rPr>
+        <w:t>a</w:t>
+      </w:r>
+      <w:proofErr w:type="spellEnd"/>
+      <w:proofErr w:type="gramEnd"/>
+      <w:r>
+        <w:rPr>
+          <w:kern w:val="0"/>
+          <w:sz w:val="24"/>
+          <w:szCs w:val="24"/>
+          <w14:ligatures w14:val="none"/>
+        </w:rPr>
+        <w:t xml:space="preserve"> l’échelle d</w:t>
+      </w:r>
+      <w:r>
+        <w:rPr>
+          <w:kern w:val="0"/>
+          <w:sz w:val="24"/>
+          <w:szCs w:val="24"/>
+          <w14:ligatures w14:val="none"/>
+        </w:rPr>
+        <w:t>u monde</w:t>
+      </w:r>
+    </w:p>
+    <w:p>
+      <w:pPr>
+        <w:tabs>
+          <w:tab w:val="left" w:pos="3915"/>
+        </w:tabs>
+        <w:rPr>
+          <w:kern w:val="0"/>
+          <w:sz w:val="24"/>
+          <w:szCs w:val="24"/>
+          <w14:ligatures w14:val="none"/>
+        </w:rPr>
+      </w:pPr>
+      <w:r>
+        <w:rPr>
+          <w:kern w:val="0"/>
+          <w:sz w:val="24"/>
+          <w:szCs w:val="24"/>
+          <w14:ligatures w14:val="none"/>
+        </w:rPr>
         <w:t>49 Dîtes ce qu’est une action en concurrence déloyale</w:t>
       </w:r>
     </w:p>
@@ -1019,6 +2717,39 @@
           <w14:ligatures w14:val="none"/>
         </w:rPr>
       </w:pPr>
+      <w:proofErr w:type="gramStart"/>
+      <w:r>
+        <w:rPr>
+          <w:kern w:val="0"/>
+          <w:sz w:val="24"/>
+          <w:szCs w:val="24"/>
+          <w14:ligatures w14:val="none"/>
+        </w:rPr>
+        <w:t>Action déposé</w:t>
+      </w:r>
+      <w:proofErr w:type="gramEnd"/>
+      <w:r>
+        <w:rPr>
+          <w:kern w:val="0"/>
+          <w:sz w:val="24"/>
+          <w:szCs w:val="24"/>
+          <w14:ligatures w14:val="none"/>
+        </w:rPr>
+        <w:t xml:space="preserve"> sur la responsabilité civile en cas de contrefaçon.</w:t>
+      </w:r>
+    </w:p>
+    <w:p>
+      <w:pPr>
+        <w:tabs>
+          <w:tab w:val="left" w:pos="3915"/>
+        </w:tabs>
+        <w:rPr>
+          <w:kern w:val="0"/>
+          <w:sz w:val="24"/>
+          <w:szCs w:val="24"/>
+          <w14:ligatures w14:val="none"/>
+        </w:rPr>
+      </w:pPr>
       <w:r>
         <w:rPr>
           <w:kern w:val="0"/>
@@ -1075,7 +2806,118 @@
           <w:szCs w:val="24"/>
           <w14:ligatures w14:val="none"/>
         </w:rPr>
-        <w:t xml:space="preserve">51 Peut-on empêcher à quelqu’un d’utiliser, en marque, son nom de famille (patronyme) ? </w:t>
+        <w:t xml:space="preserve">Ce ne doit pas être un mot du </w:t>
+      </w:r>
+      <w:proofErr w:type="spellStart"/>
+      <w:r>
+        <w:rPr>
+          <w:kern w:val="0"/>
+          <w:sz w:val="24"/>
+          <w:szCs w:val="24"/>
+          <w14:ligatures w14:val="none"/>
+        </w:rPr>
+        <w:t>language</w:t>
+      </w:r>
+      <w:proofErr w:type="spellEnd"/>
+      <w:r>
+        <w:rPr>
+          <w:kern w:val="0"/>
+          <w:sz w:val="24"/>
+          <w:szCs w:val="24"/>
+          <w14:ligatures w14:val="none"/>
+        </w:rPr>
+        <w:t xml:space="preserve"> commun, et ne doit pas être trompeur sur les produits de la marque</w:t>
+      </w:r>
+    </w:p>
+    <w:p>
+      <w:pPr>
+        <w:tabs>
+          <w:tab w:val="left" w:pos="3915"/>
+        </w:tabs>
+        <w:rPr>
+          <w:kern w:val="0"/>
+          <w:sz w:val="24"/>
+          <w:szCs w:val="24"/>
+          <w14:ligatures w14:val="none"/>
+        </w:rPr>
+      </w:pPr>
+      <w:r>
+        <w:rPr>
+          <w:kern w:val="0"/>
+          <w:sz w:val="24"/>
+          <w:szCs w:val="24"/>
+          <w14:ligatures w14:val="none"/>
+        </w:rPr>
+        <w:t xml:space="preserve">51 Peut-on </w:t>
+      </w:r>
+      <w:proofErr w:type="gramStart"/>
+      <w:r>
+        <w:rPr>
+          <w:kern w:val="0"/>
+          <w:sz w:val="24"/>
+          <w:szCs w:val="24"/>
+          <w14:ligatures w14:val="none"/>
+        </w:rPr>
+        <w:t>empêcher à</w:t>
+      </w:r>
+      <w:proofErr w:type="gramEnd"/>
+      <w:r>
+        <w:rPr>
+          <w:kern w:val="0"/>
+          <w:sz w:val="24"/>
+          <w:szCs w:val="24"/>
+          <w14:ligatures w14:val="none"/>
+        </w:rPr>
+        <w:t xml:space="preserve"> quelqu’un d’utiliser, en marque, son nom de famille (patronyme) ? </w:t>
+      </w:r>
+    </w:p>
+    <w:p>
+      <w:pPr>
+        <w:tabs>
+          <w:tab w:val="left" w:pos="3915"/>
+        </w:tabs>
+        <w:rPr>
+          <w:kern w:val="0"/>
+          <w:sz w:val="24"/>
+          <w:szCs w:val="24"/>
+          <w14:ligatures w14:val="none"/>
+        </w:rPr>
+      </w:pPr>
+      <w:r>
+        <w:rPr>
+          <w:kern w:val="0"/>
+          <w:sz w:val="24"/>
+          <w:szCs w:val="24"/>
+          <w14:ligatures w14:val="none"/>
+        </w:rPr>
+        <w:t>Il est impossible d’</w:t>
+      </w:r>
+      <w:r>
+        <w:rPr>
+          <w:kern w:val="0"/>
+          <w:sz w:val="24"/>
+          <w:szCs w:val="24"/>
+          <w14:ligatures w14:val="none"/>
+        </w:rPr>
+        <w:t>empêcher</w:t>
+      </w:r>
+      <w:r>
+        <w:rPr>
+          <w:kern w:val="0"/>
+          <w:sz w:val="24"/>
+          <w:szCs w:val="24"/>
+          <w14:ligatures w14:val="none"/>
+        </w:rPr>
+        <w:t xml:space="preserve"> </w:t>
+      </w:r>
+      <w:r>
+        <w:rPr>
+          <w:kern w:val="0"/>
+          <w:sz w:val="24"/>
+          <w:szCs w:val="24"/>
+          <w14:ligatures w14:val="none"/>
+        </w:rPr>
+        <w:t>quelqu’un d’utiliser son nom de famille en tant que marque</w:t>
       </w:r>
     </w:p>
     <w:p>
@@ -1119,6 +2961,28 @@
           <w:szCs w:val="24"/>
           <w14:ligatures w14:val="none"/>
         </w:rPr>
+        <w:t>C’est l’ensemble des composant extérieur d’une entreprise n’ayant pas de lien direct avec elle</w:t>
+      </w:r>
+    </w:p>
+    <w:p>
+      <w:pPr>
+        <w:tabs>
+          <w:tab w:val="left" w:pos="3915"/>
+        </w:tabs>
+        <w:rPr>
+          <w:kern w:val="0"/>
+          <w:sz w:val="24"/>
+          <w:szCs w:val="24"/>
+          <w14:ligatures w14:val="none"/>
+        </w:rPr>
+      </w:pPr>
+      <w:r>
+        <w:rPr>
+          <w:kern w:val="0"/>
+          <w:sz w:val="24"/>
+          <w:szCs w:val="24"/>
+          <w14:ligatures w14:val="none"/>
+        </w:rPr>
         <w:t>53 Expliquez ce qu’est le micro-environnement</w:t>
       </w:r>
     </w:p>
@@ -1141,6 +3005,29 @@
           <w:szCs w:val="24"/>
           <w14:ligatures w14:val="none"/>
         </w:rPr>
+        <w:lastRenderedPageBreak/>
+        <w:t>C’est l’ensemble des composants extérieurs ayant un lien direct avec une entreprise</w:t>
+      </w:r>
+    </w:p>
+    <w:p>
+      <w:pPr>
+        <w:tabs>
+          <w:tab w:val="left" w:pos="3915"/>
+        </w:tabs>
+        <w:rPr>
+          <w:kern w:val="0"/>
+          <w:sz w:val="24"/>
+          <w:szCs w:val="24"/>
+          <w14:ligatures w14:val="none"/>
+        </w:rPr>
+      </w:pPr>
+      <w:r>
+        <w:rPr>
+          <w:kern w:val="0"/>
+          <w:sz w:val="24"/>
+          <w:szCs w:val="24"/>
+          <w14:ligatures w14:val="none"/>
+        </w:rPr>
         <w:t xml:space="preserve">54 Expliquez ce qu’est le méso-environnement </w:t>
       </w:r>
     </w:p>
@@ -1163,6 +3050,28 @@
           <w:szCs w:val="24"/>
           <w14:ligatures w14:val="none"/>
         </w:rPr>
+        <w:t>C’est l’ensemble des composant interne à l’entreprise</w:t>
+      </w:r>
+    </w:p>
+    <w:p>
+      <w:pPr>
+        <w:tabs>
+          <w:tab w:val="left" w:pos="3915"/>
+        </w:tabs>
+        <w:rPr>
+          <w:kern w:val="0"/>
+          <w:sz w:val="24"/>
+          <w:szCs w:val="24"/>
+          <w14:ligatures w14:val="none"/>
+        </w:rPr>
+      </w:pPr>
+      <w:r>
+        <w:rPr>
+          <w:kern w:val="0"/>
+          <w:sz w:val="24"/>
+          <w:szCs w:val="24"/>
+          <w14:ligatures w14:val="none"/>
+        </w:rPr>
         <w:t>55 Expliquez ce qu’est le PESTEL et à quelle sorte d’analyse il se prête</w:t>
       </w:r>
     </w:p>
@@ -1185,6 +3094,48 @@
           <w:szCs w:val="24"/>
           <w14:ligatures w14:val="none"/>
         </w:rPr>
+        <w:t xml:space="preserve">PESTEL permet d’analyser les facteurs </w:t>
+      </w:r>
+      <w:proofErr w:type="spellStart"/>
+      <w:r>
+        <w:rPr>
+          <w:kern w:val="0"/>
+          <w:sz w:val="24"/>
+          <w:szCs w:val="24"/>
+          <w14:ligatures w14:val="none"/>
+        </w:rPr>
+        <w:t>Polotiques</w:t>
+      </w:r>
+      <w:proofErr w:type="spellEnd"/>
+      <w:r>
+        <w:rPr>
+          <w:kern w:val="0"/>
+          <w:sz w:val="24"/>
+          <w:szCs w:val="24"/>
+          <w14:ligatures w14:val="none"/>
+        </w:rPr>
+        <w:t>, Economiques, Socioculturel, Technologique, Environnementaux et Légaux d’une entreprise. Elle permet de récolter les informations qui dans le futur, pourrait être une opportunité ou une menace pour l’entreprise</w:t>
+      </w:r>
+    </w:p>
+    <w:p>
+      <w:pPr>
+        <w:tabs>
+          <w:tab w:val="left" w:pos="3915"/>
+        </w:tabs>
+        <w:rPr>
+          <w:kern w:val="0"/>
+          <w:sz w:val="24"/>
+          <w:szCs w:val="24"/>
+          <w14:ligatures w14:val="none"/>
+        </w:rPr>
+      </w:pPr>
+      <w:r>
+        <w:rPr>
+          <w:kern w:val="0"/>
+          <w:sz w:val="24"/>
+          <w:szCs w:val="24"/>
+          <w14:ligatures w14:val="none"/>
+        </w:rPr>
         <w:t xml:space="preserve">56 Donnez les effets de l’innovation, au sens de </w:t>
       </w:r>
       <w:proofErr w:type="spellStart"/>
@@ -1205,7 +3156,42 @@
           <w:szCs w:val="24"/>
           <w14:ligatures w14:val="none"/>
         </w:rPr>
-        <w:t xml:space="preserve">, tant pour l’économie que pour l’entreprise </w:t>
+        <w:t>, tant pour l’économie que pour l’entreprise</w:t>
+      </w:r>
+    </w:p>
+    <w:p>
+      <w:pPr>
+        <w:tabs>
+          <w:tab w:val="left" w:pos="3915"/>
+        </w:tabs>
+        <w:rPr>
+          <w:kern w:val="0"/>
+          <w:sz w:val="24"/>
+          <w:szCs w:val="24"/>
+          <w14:ligatures w14:val="none"/>
+        </w:rPr>
+      </w:pPr>
+    </w:p>
+    <w:p>
+      <w:pPr>
+        <w:tabs>
+          <w:tab w:val="left" w:pos="3915"/>
+        </w:tabs>
+        <w:rPr>
+          <w:kern w:val="0"/>
+          <w:sz w:val="24"/>
+          <w:szCs w:val="24"/>
+          <w14:ligatures w14:val="none"/>
+        </w:rPr>
+      </w:pPr>
+      <w:r>
+        <w:rPr>
+          <w:kern w:val="0"/>
+          <w:sz w:val="24"/>
+          <w:szCs w:val="24"/>
+          <w14:ligatures w14:val="none"/>
+        </w:rPr>
+        <w:t xml:space="preserve"> </w:t>
       </w:r>
     </w:p>
     <w:p>
@@ -1291,6 +3277,243 @@
     </w:sectPr>
   </w:body>
 </w:document>
+</file>
+
+<file path=word/numbering.xml><?xml version="1.0" encoding="utf-8"?>
+<w:numbering xmlns:wpc="http://schemas.microsoft.com/office/word/2010/wordprocessingCanvas" xmlns:cx="http://schemas.microsoft.com/office/drawing/2014/chartex" xmlns:cx1="http://schemas.microsoft.com/office/drawing/2015/9/8/chartex" xmlns:cx2="http://schemas.microsoft.com/office/drawing/2015/10/21/chartex" xmlns:cx3="http://schemas.microsoft.com/office/drawing/2016/5/9/chartex" xmlns:cx4="http://schemas.microsoft.com/office/drawing/2016/5/10/chartex" xmlns:cx5="http://schemas.microsoft.com/office/drawing/2016/5/11/chartex" xmlns:cx6="http://schemas.microsoft.com/office/drawing/2016/5/12/chartex" xmlns:cx7="http://schemas.microsoft.com/office/drawing/2016/5/13/chartex" xmlns:cx8="http://schemas.microsoft.com/office/drawing/2016/5/14/chartex" xmlns:mc="http://schemas.openxmlformats.org/markup-compatibility/2006" xmlns:aink="http://schemas.microsoft.com/office/drawing/2016/ink" xmlns:am3d="http://schemas.microsoft.com/office/drawing/2017/model3d" xmlns:o="urn:schemas-microsoft-com:office:office" xmlns:oel="http://schemas.microsoft.com/office/2019/extlst" xmlns:r="http://schemas.openxmlformats.org/officeDocument/2006/relationships" xmlns:m="http://schemas.openxmlformats.org/officeDocument/2006/math" xmlns:v="urn:schemas-microsoft-com:vml" xmlns:wp14="http://schemas.microsoft.com/office/word/2010/wordprocessingDrawing" xmlns:wp="http://schemas.openxmlformats.org/drawingml/2006/wordprocessingDrawing" xmlns:w10="urn:schemas-microsoft-com:office:word" xmlns:w="http://schemas.openxmlformats.org/wordprocessingml/2006/main" xmlns:w14="http://schemas.microsoft.com/office/word/2010/wordml" xmlns:w15="http://schemas.microsoft.com/office/word/2012/wordml" xmlns:w16cex="http://schemas.microsoft.com/office/word/2018/wordml/cex" xmlns:w16cid="http://schemas.microsoft.com/office/word/2016/wordml/cid" xmlns:w16="http://schemas.microsoft.com/office/word/2018/wordml" xmlns:w16sdtdh="http://schemas.microsoft.com/office/word/2020/wordml/sdtdatahash" xmlns:w16se="http://schemas.microsoft.com/office/word/2015/wordml/symex" xmlns:wpg="http://schemas.microsoft.com/office/word/2010/wordprocessingGroup" xmlns:wpi="http://schemas.microsoft.com/office/word/2010/wordprocessingInk" xmlns:wne="http://schemas.microsoft.com/office/word/2006/wordml" xmlns:wps="http://schemas.microsoft.com/office/word/2010/wordprocessingShape" mc:Ignorable="w14 w15 w16se w16cid w16 w16cex w16sdtdh wp14">
+  <w:abstractNum w:abstractNumId="0" w15:restartNumberingAfterBreak="0">
+    <w:nsid w:val="337B22D1"/>
+    <w:multiLevelType w:val="hybridMultilevel"/>
+    <w:tmpl w:val="3E080232"/>
+    <w:lvl w:ilvl="0" w:tplc="9F4EDF96">
+      <w:start w:val="1"/>
+      <w:numFmt w:val="bullet"/>
+      <w:lvlText w:val="-"/>
+      <w:lvlJc w:val="left"/>
+      <w:pPr>
+        <w:ind w:left="720" w:hanging="360"/>
+      </w:pPr>
+      <w:rPr>
+        <w:rFonts w:ascii="Calibri" w:eastAsiaTheme="minorHAnsi" w:hAnsi="Calibri" w:cs="Calibri" w:hint="default"/>
+      </w:rPr>
+    </w:lvl>
+    <w:lvl w:ilvl="1" w:tplc="040C0003" w:tentative="1">
+      <w:start w:val="1"/>
+      <w:numFmt w:val="bullet"/>
+      <w:lvlText w:val="o"/>
+      <w:lvlJc w:val="left"/>
+      <w:pPr>
+        <w:ind w:left="1440" w:hanging="360"/>
+      </w:pPr>
+      <w:rPr>
+        <w:rFonts w:ascii="Courier New" w:hAnsi="Courier New" w:cs="Courier New" w:hint="default"/>
+      </w:rPr>
+    </w:lvl>
+    <w:lvl w:ilvl="2" w:tplc="040C0005" w:tentative="1">
+      <w:start w:val="1"/>
+      <w:numFmt w:val="bullet"/>
+      <w:lvlText w:val=""/>
+      <w:lvlJc w:val="left"/>
+      <w:pPr>
+        <w:ind w:left="2160" w:hanging="360"/>
+      </w:pPr>
+      <w:rPr>
+        <w:rFonts w:ascii="Wingdings" w:hAnsi="Wingdings" w:hint="default"/>
+      </w:rPr>
+    </w:lvl>
+    <w:lvl w:ilvl="3" w:tplc="040C0001" w:tentative="1">
+      <w:start w:val="1"/>
+      <w:numFmt w:val="bullet"/>
+      <w:lvlText w:val=""/>
+      <w:lvlJc w:val="left"/>
+      <w:pPr>
+        <w:ind w:left="2880" w:hanging="360"/>
+      </w:pPr>
+      <w:rPr>
+        <w:rFonts w:ascii="Symbol" w:hAnsi="Symbol" w:hint="default"/>
+      </w:rPr>
+    </w:lvl>
+    <w:lvl w:ilvl="4" w:tplc="040C0003" w:tentative="1">
+      <w:start w:val="1"/>
+      <w:numFmt w:val="bullet"/>
+      <w:lvlText w:val="o"/>
+      <w:lvlJc w:val="left"/>
+      <w:pPr>
+        <w:ind w:left="3600" w:hanging="360"/>
+      </w:pPr>
+      <w:rPr>
+        <w:rFonts w:ascii="Courier New" w:hAnsi="Courier New" w:cs="Courier New" w:hint="default"/>
+      </w:rPr>
+    </w:lvl>
+    <w:lvl w:ilvl="5" w:tplc="040C0005" w:tentative="1">
+      <w:start w:val="1"/>
+      <w:numFmt w:val="bullet"/>
+      <w:lvlText w:val=""/>
+      <w:lvlJc w:val="left"/>
+      <w:pPr>
+        <w:ind w:left="4320" w:hanging="360"/>
+      </w:pPr>
+      <w:rPr>
+        <w:rFonts w:ascii="Wingdings" w:hAnsi="Wingdings" w:hint="default"/>
+      </w:rPr>
+    </w:lvl>
+    <w:lvl w:ilvl="6" w:tplc="040C0001" w:tentative="1">
+      <w:start w:val="1"/>
+      <w:numFmt w:val="bullet"/>
+      <w:lvlText w:val=""/>
+      <w:lvlJc w:val="left"/>
+      <w:pPr>
+        <w:ind w:left="5040" w:hanging="360"/>
+      </w:pPr>
+      <w:rPr>
+        <w:rFonts w:ascii="Symbol" w:hAnsi="Symbol" w:hint="default"/>
+      </w:rPr>
+    </w:lvl>
+    <w:lvl w:ilvl="7" w:tplc="040C0003" w:tentative="1">
+      <w:start w:val="1"/>
+      <w:numFmt w:val="bullet"/>
+      <w:lvlText w:val="o"/>
+      <w:lvlJc w:val="left"/>
+      <w:pPr>
+        <w:ind w:left="5760" w:hanging="360"/>
+      </w:pPr>
+      <w:rPr>
+        <w:rFonts w:ascii="Courier New" w:hAnsi="Courier New" w:cs="Courier New" w:hint="default"/>
+      </w:rPr>
+    </w:lvl>
+    <w:lvl w:ilvl="8" w:tplc="040C0005" w:tentative="1">
+      <w:start w:val="1"/>
+      <w:numFmt w:val="bullet"/>
+      <w:lvlText w:val=""/>
+      <w:lvlJc w:val="left"/>
+      <w:pPr>
+        <w:ind w:left="6480" w:hanging="360"/>
+      </w:pPr>
+      <w:rPr>
+        <w:rFonts w:ascii="Wingdings" w:hAnsi="Wingdings" w:hint="default"/>
+      </w:rPr>
+    </w:lvl>
+  </w:abstractNum>
+  <w:abstractNum w:abstractNumId="1" w15:restartNumberingAfterBreak="0">
+    <w:nsid w:val="68171890"/>
+    <w:multiLevelType w:val="hybridMultilevel"/>
+    <w:tmpl w:val="D05E317A"/>
+    <w:lvl w:ilvl="0" w:tplc="318874F2">
+      <w:start w:val="15"/>
+      <w:numFmt w:val="bullet"/>
+      <w:lvlText w:val="-"/>
+      <w:lvlJc w:val="left"/>
+      <w:pPr>
+        <w:ind w:left="420" w:hanging="360"/>
+      </w:pPr>
+      <w:rPr>
+        <w:rFonts w:ascii="Calibri" w:eastAsiaTheme="minorHAnsi" w:hAnsi="Calibri" w:cs="Calibri" w:hint="default"/>
+      </w:rPr>
+    </w:lvl>
+    <w:lvl w:ilvl="1" w:tplc="040C0003" w:tentative="1">
+      <w:start w:val="1"/>
+      <w:numFmt w:val="bullet"/>
+      <w:lvlText w:val="o"/>
+      <w:lvlJc w:val="left"/>
+      <w:pPr>
+        <w:ind w:left="1140" w:hanging="360"/>
+      </w:pPr>
+      <w:rPr>
+        <w:rFonts w:ascii="Courier New" w:hAnsi="Courier New" w:cs="Courier New" w:hint="default"/>
+      </w:rPr>
+    </w:lvl>
+    <w:lvl w:ilvl="2" w:tplc="040C0005" w:tentative="1">
+      <w:start w:val="1"/>
+      <w:numFmt w:val="bullet"/>
+      <w:lvlText w:val=""/>
+      <w:lvlJc w:val="left"/>
+      <w:pPr>
+        <w:ind w:left="1860" w:hanging="360"/>
+      </w:pPr>
+      <w:rPr>
+        <w:rFonts w:ascii="Wingdings" w:hAnsi="Wingdings" w:hint="default"/>
+      </w:rPr>
+    </w:lvl>
+    <w:lvl w:ilvl="3" w:tplc="040C0001" w:tentative="1">
+      <w:start w:val="1"/>
+      <w:numFmt w:val="bullet"/>
+      <w:lvlText w:val=""/>
+      <w:lvlJc w:val="left"/>
+      <w:pPr>
+        <w:ind w:left="2580" w:hanging="360"/>
+      </w:pPr>
+      <w:rPr>
+        <w:rFonts w:ascii="Symbol" w:hAnsi="Symbol" w:hint="default"/>
+      </w:rPr>
+    </w:lvl>
+    <w:lvl w:ilvl="4" w:tplc="040C0003" w:tentative="1">
+      <w:start w:val="1"/>
+      <w:numFmt w:val="bullet"/>
+      <w:lvlText w:val="o"/>
+      <w:lvlJc w:val="left"/>
+      <w:pPr>
+        <w:ind w:left="3300" w:hanging="360"/>
+      </w:pPr>
+      <w:rPr>
+        <w:rFonts w:ascii="Courier New" w:hAnsi="Courier New" w:cs="Courier New" w:hint="default"/>
+      </w:rPr>
+    </w:lvl>
+    <w:lvl w:ilvl="5" w:tplc="040C0005" w:tentative="1">
+      <w:start w:val="1"/>
+      <w:numFmt w:val="bullet"/>
+      <w:lvlText w:val=""/>
+      <w:lvlJc w:val="left"/>
+      <w:pPr>
+        <w:ind w:left="4020" w:hanging="360"/>
+      </w:pPr>
+      <w:rPr>
+        <w:rFonts w:ascii="Wingdings" w:hAnsi="Wingdings" w:hint="default"/>
+      </w:rPr>
+    </w:lvl>
+    <w:lvl w:ilvl="6" w:tplc="040C0001" w:tentative="1">
+      <w:start w:val="1"/>
+      <w:numFmt w:val="bullet"/>
+      <w:lvlText w:val=""/>
+      <w:lvlJc w:val="left"/>
+      <w:pPr>
+        <w:ind w:left="4740" w:hanging="360"/>
+      </w:pPr>
+      <w:rPr>
+        <w:rFonts w:ascii="Symbol" w:hAnsi="Symbol" w:hint="default"/>
+      </w:rPr>
+    </w:lvl>
+    <w:lvl w:ilvl="7" w:tplc="040C0003" w:tentative="1">
+      <w:start w:val="1"/>
+      <w:numFmt w:val="bullet"/>
+      <w:lvlText w:val="o"/>
+      <w:lvlJc w:val="left"/>
+      <w:pPr>
+        <w:ind w:left="5460" w:hanging="360"/>
+      </w:pPr>
+      <w:rPr>
+        <w:rFonts w:ascii="Courier New" w:hAnsi="Courier New" w:cs="Courier New" w:hint="default"/>
+      </w:rPr>
+    </w:lvl>
+    <w:lvl w:ilvl="8" w:tplc="040C0005" w:tentative="1">
+      <w:start w:val="1"/>
+      <w:numFmt w:val="bullet"/>
+      <w:lvlText w:val=""/>
+      <w:lvlJc w:val="left"/>
+      <w:pPr>
+        <w:ind w:left="6180" w:hanging="360"/>
+      </w:pPr>
+      <w:rPr>
+        <w:rFonts w:ascii="Wingdings" w:hAnsi="Wingdings" w:hint="default"/>
+      </w:rPr>
+    </w:lvl>
+  </w:abstractNum>
+  <w:num w:numId="1" w16cid:durableId="199630099">
+    <w:abstractNumId w:val="1"/>
+  </w:num>
+  <w:num w:numId="2" w16cid:durableId="1868250547">
+    <w:abstractNumId w:val="0"/>
+  </w:num>
+</w:numbering>
 </file>
 
 <file path=word/styles.xml><?xml version="1.0" encoding="utf-8"?>
@@ -1725,6 +3948,17 @@
     <w:semiHidden/>
     <w:unhideWhenUsed/>
   </w:style>
+  <w:style w:type="paragraph" w:styleId="Paragraphedeliste">
+    <w:name w:val="List Paragraph"/>
+    <w:basedOn w:val="Normal"/>
+    <w:uiPriority w:val="34"/>
+    <w:qFormat/>
+    <w:rsid w:val="00885816"/>
+    <w:pPr>
+      <w:ind w:left="720"/>
+      <w:contextualSpacing/>
+    </w:pPr>
+  </w:style>
 </w:styles>
 </file>
 

</xml_diff>